<commit_message>
Stop the section headings from repeating across a page break
The section title and instruction rows carried the repeating
table-header flag inherited from the original form, so Word
reprinted a heading whenever its table broke across pages. Flag
removed from all nine rows, and the delivery methods box is now
marked not to split.
</commit_message>
<xml_diff>
--- a/committee/ccc/papers/geoc-alignment-form-proposed.docx
+++ b/committee/ccc/papers/geoc-alignment-form-proposed.docx
@@ -77,7 +77,6 @@
       <w:tr>
         <w:trPr>
           <w:trHeight w:val="180"/>
-          <w:tblHeader/>
         </w:trPr>
         <w:tc>
           <w:tcPr>
@@ -112,7 +111,6 @@
       <w:tr>
         <w:trPr>
           <w:trHeight w:val="48"/>
-          <w:tblHeader/>
         </w:trPr>
         <w:tc>
           <w:tcPr>
@@ -135,7 +133,6 @@
       <w:tr>
         <w:trPr>
           <w:trHeight w:val="432"/>
-          <w:tblHeader/>
         </w:trPr>
         <w:tc>
           <w:tcPr>
@@ -518,7 +515,6 @@
       <w:tr>
         <w:trPr>
           <w:trHeight w:val="180"/>
-          <w:tblHeader/>
         </w:trPr>
         <w:tc>
           <w:tcPr>
@@ -553,7 +549,6 @@
       <w:tr>
         <w:trPr>
           <w:trHeight w:val="48"/>
-          <w:tblHeader/>
         </w:trPr>
         <w:tc>
           <w:tcPr>
@@ -576,7 +571,6 @@
       <w:tr>
         <w:trPr>
           <w:trHeight w:val="432"/>
-          <w:tblHeader/>
         </w:trPr>
         <w:tc>
           <w:tcPr>
@@ -875,7 +869,6 @@
       <w:tr>
         <w:trPr>
           <w:trHeight w:val="180"/>
-          <w:tblHeader/>
         </w:trPr>
         <w:tc>
           <w:tcPr>
@@ -910,7 +903,6 @@
       <w:tr>
         <w:trPr>
           <w:trHeight w:val="48"/>
-          <w:tblHeader/>
         </w:trPr>
         <w:tc>
           <w:tcPr>
@@ -933,7 +925,6 @@
       <w:tr>
         <w:trPr>
           <w:trHeight w:val="432"/>
-          <w:tblHeader/>
         </w:trPr>
         <w:tc>
           <w:tcPr>
@@ -971,6 +962,7 @@
       </w:tr>
       <w:tr>
         <w:trPr>
+          <w:cantSplit/>
           <w:trHeight w:val="620"/>
         </w:trPr>
         <w:tc>

</xml_diff>

<commit_message>
Make proposal type a row of check boxes
Recertification, revision only, and new course now sit on one line
as check boxes, replacing the sentence and the fill-in line. Boxes
are Wingdings 'o'.
</commit_message>
<xml_diff>
--- a/committee/ccc/papers/geoc-alignment-form-proposed.docx
+++ b/committee/ccc/papers/geoc-alignment-form-proposed.docx
@@ -21,12 +21,34 @@
     <w:p/>
     <w:p>
       <w:r>
-        <w:t xml:space="preserve">Please indicate if the course is up for Recertification, Revision only (not up for Recertification), or New course.</w:t>
+        <w:t xml:space="preserve">Proposal type     </w:t>
       </w:r>
-    </w:p>
-    <w:p>
       <w:r>
-        <w:t xml:space="preserve">Proposal type ____________________________________________</w:t>
+        <w:rPr>
+          <w:rFonts w:ascii="Wingdings" w:hAnsi="Wingdings" w:cs="Wingdings"/>
+        </w:rPr>
+        <w:t>o</w:t>
+      </w:r>
+      <w:r>
+        <w:t xml:space="preserve">  Recertification      </w:t>
+      </w:r>
+      <w:r>
+        <w:rPr>
+          <w:rFonts w:ascii="Wingdings" w:hAnsi="Wingdings" w:cs="Wingdings"/>
+        </w:rPr>
+        <w:t>o</w:t>
+      </w:r>
+      <w:r>
+        <w:t xml:space="preserve">  Revision only (not up for Recertification)      </w:t>
+      </w:r>
+      <w:r>
+        <w:rPr>
+          <w:rFonts w:ascii="Wingdings" w:hAnsi="Wingdings" w:cs="Wingdings"/>
+        </w:rPr>
+        <w:t>o</w:t>
+      </w:r>
+      <w:r>
+        <w:t xml:space="preserve">  New course</w:t>
       </w:r>
     </w:p>
     <w:p>

</xml_diff>

<commit_message>
Turn the area field into check boxes with the current labels
GE/Overlay/Code area is now four grouped rows of check boxes
covering 1A through 6, UD-3 through UD-5, the three overlays, and
US-1 through US-3, rather than a blank line. The prompt points to
Current Breadth Area(s) Approved in Curriculog, which is where the
approved areas are shown, and a note links the GE Guide for the
current labels next to the former ones.

Delivery methods row shortened and rows tightened to hold one
page.
</commit_message>
<xml_diff>
--- a/committee/ccc/papers/geoc-alignment-form-proposed.docx
+++ b/committee/ccc/papers/geoc-alignment-form-proposed.docx
@@ -58,7 +58,231 @@
     </w:p>
     <w:p>
       <w:r>
-        <w:t xml:space="preserve">GE/Overlay/Code Area for this course ____________________________________</w:t>
+        <w:t xml:space="preserve">GE/Overlay/Code Area for this course, as approved in Curriculog under Current Breadth Area(s) Approved:</w:t>
+      </w:r>
+    </w:p>
+    <w:p>
+      <w:r>
+        <w:t xml:space="preserve">Lower division   </w:t>
+      </w:r>
+      <w:r>
+        <w:rPr>
+          <w:rFonts w:ascii="Wingdings" w:hAnsi="Wingdings" w:cs="Wingdings"/>
+        </w:rPr>
+        <w:t>o</w:t>
+      </w:r>
+      <w:r>
+        <w:t xml:space="preserve">  1A   </w:t>
+      </w:r>
+      <w:r>
+        <w:rPr>
+          <w:rFonts w:ascii="Wingdings" w:hAnsi="Wingdings" w:cs="Wingdings"/>
+        </w:rPr>
+        <w:t>o</w:t>
+      </w:r>
+      <w:r>
+        <w:t xml:space="preserve">  1B   </w:t>
+      </w:r>
+      <w:r>
+        <w:rPr>
+          <w:rFonts w:ascii="Wingdings" w:hAnsi="Wingdings" w:cs="Wingdings"/>
+        </w:rPr>
+        <w:t>o</w:t>
+      </w:r>
+      <w:r>
+        <w:t xml:space="preserve">  1C   </w:t>
+      </w:r>
+      <w:r>
+        <w:rPr>
+          <w:rFonts w:ascii="Wingdings" w:hAnsi="Wingdings" w:cs="Wingdings"/>
+        </w:rPr>
+        <w:t>o</w:t>
+      </w:r>
+      <w:r>
+        <w:t xml:space="preserve">  2   </w:t>
+      </w:r>
+      <w:r>
+        <w:rPr>
+          <w:rFonts w:ascii="Wingdings" w:hAnsi="Wingdings" w:cs="Wingdings"/>
+        </w:rPr>
+        <w:t>o</w:t>
+      </w:r>
+      <w:r>
+        <w:t xml:space="preserve">  3A   </w:t>
+      </w:r>
+      <w:r>
+        <w:rPr>
+          <w:rFonts w:ascii="Wingdings" w:hAnsi="Wingdings" w:cs="Wingdings"/>
+        </w:rPr>
+        <w:t>o</w:t>
+      </w:r>
+      <w:r>
+        <w:t xml:space="preserve">  3B   </w:t>
+      </w:r>
+      <w:r>
+        <w:rPr>
+          <w:rFonts w:ascii="Wingdings" w:hAnsi="Wingdings" w:cs="Wingdings"/>
+        </w:rPr>
+        <w:t>o</w:t>
+      </w:r>
+      <w:r>
+        <w:t xml:space="preserve">  4   </w:t>
+      </w:r>
+      <w:r>
+        <w:rPr>
+          <w:rFonts w:ascii="Wingdings" w:hAnsi="Wingdings" w:cs="Wingdings"/>
+        </w:rPr>
+        <w:t>o</w:t>
+      </w:r>
+      <w:r>
+        <w:t xml:space="preserve">  5A   </w:t>
+      </w:r>
+      <w:r>
+        <w:rPr>
+          <w:rFonts w:ascii="Wingdings" w:hAnsi="Wingdings" w:cs="Wingdings"/>
+        </w:rPr>
+        <w:t>o</w:t>
+      </w:r>
+      <w:r>
+        <w:t xml:space="preserve">  5B   </w:t>
+      </w:r>
+      <w:r>
+        <w:rPr>
+          <w:rFonts w:ascii="Wingdings" w:hAnsi="Wingdings" w:cs="Wingdings"/>
+        </w:rPr>
+        <w:t>o</w:t>
+      </w:r>
+      <w:r>
+        <w:t xml:space="preserve">  5C   </w:t>
+      </w:r>
+      <w:r>
+        <w:rPr>
+          <w:rFonts w:ascii="Wingdings" w:hAnsi="Wingdings" w:cs="Wingdings"/>
+        </w:rPr>
+        <w:t>o</w:t>
+      </w:r>
+      <w:r>
+        <w:t xml:space="preserve">  6   </w:t>
+      </w:r>
+    </w:p>
+    <w:p>
+      <w:r>
+        <w:t xml:space="preserve">Upper division   </w:t>
+      </w:r>
+      <w:r>
+        <w:rPr>
+          <w:rFonts w:ascii="Wingdings" w:hAnsi="Wingdings" w:cs="Wingdings"/>
+        </w:rPr>
+        <w:t>o</w:t>
+      </w:r>
+      <w:r>
+        <w:t xml:space="preserve">  UD-3   </w:t>
+      </w:r>
+      <w:r>
+        <w:rPr>
+          <w:rFonts w:ascii="Wingdings" w:hAnsi="Wingdings" w:cs="Wingdings"/>
+        </w:rPr>
+        <w:t>o</w:t>
+      </w:r>
+      <w:r>
+        <w:t xml:space="preserve">  UD-4   </w:t>
+      </w:r>
+      <w:r>
+        <w:rPr>
+          <w:rFonts w:ascii="Wingdings" w:hAnsi="Wingdings" w:cs="Wingdings"/>
+        </w:rPr>
+        <w:t>o</w:t>
+      </w:r>
+      <w:r>
+        <w:t xml:space="preserve">  UD-5   </w:t>
+      </w:r>
+    </w:p>
+    <w:p>
+      <w:r>
+        <w:t xml:space="preserve">Overlay   </w:t>
+      </w:r>
+      <w:r>
+        <w:rPr>
+          <w:rFonts w:ascii="Wingdings" w:hAnsi="Wingdings" w:cs="Wingdings"/>
+        </w:rPr>
+        <w:t>o</w:t>
+      </w:r>
+      <w:r>
+        <w:t xml:space="preserve">  Diversity   </w:t>
+      </w:r>
+      <w:r>
+        <w:rPr>
+          <w:rFonts w:ascii="Wingdings" w:hAnsi="Wingdings" w:cs="Wingdings"/>
+        </w:rPr>
+        <w:t>o</w:t>
+      </w:r>
+      <w:r>
+        <w:t xml:space="preserve">  Social Justice   </w:t>
+      </w:r>
+      <w:r>
+        <w:rPr>
+          <w:rFonts w:ascii="Wingdings" w:hAnsi="Wingdings" w:cs="Wingdings"/>
+        </w:rPr>
+        <w:t>o</w:t>
+      </w:r>
+      <w:r>
+        <w:t xml:space="preserve">  Sustainability   </w:t>
+      </w:r>
+      <w:r>
+        <w:t xml:space="preserve">    Code   </w:t>
+      </w:r>
+      <w:r>
+        <w:rPr>
+          <w:rFonts w:ascii="Wingdings" w:hAnsi="Wingdings" w:cs="Wingdings"/>
+        </w:rPr>
+        <w:t>o</w:t>
+      </w:r>
+      <w:r>
+        <w:t xml:space="preserve">  US-1   </w:t>
+      </w:r>
+      <w:r>
+        <w:rPr>
+          <w:rFonts w:ascii="Wingdings" w:hAnsi="Wingdings" w:cs="Wingdings"/>
+        </w:rPr>
+        <w:t>o</w:t>
+      </w:r>
+      <w:r>
+        <w:t xml:space="preserve">  US-2   </w:t>
+      </w:r>
+      <w:r>
+        <w:rPr>
+          <w:rFonts w:ascii="Wingdings" w:hAnsi="Wingdings" w:cs="Wingdings"/>
+        </w:rPr>
+        <w:t>o</w:t>
+      </w:r>
+      <w:r>
+        <w:t xml:space="preserve">  US-3   </w:t>
+      </w:r>
+    </w:p>
+    <w:p>
+      <w:r>
+        <w:rPr>
+          <w:i/>
+          <w:iCs/>
+        </w:rPr>
+        <w:t xml:space="preserve">Areas were relabeled for Fall 2025. The </w:t>
+      </w:r>
+      <w:hyperlink r:id="rId20" w:history="1">
+        <w:r>
+          <w:rPr>
+            <w:rStyle w:val="Hyperlink"/>
+            <w:i/>
+            <w:iCs/>
+          </w:rPr>
+          <w:t>GE Guide</w:t>
+        </w:r>
+      </w:hyperlink>
+      <w:r>
+        <w:rPr>
+          <w:i/>
+          <w:iCs/>
+        </w:rPr>
+        <w:t xml:space="preserve"> lists the current labels alongside the former ones.</w:t>
       </w:r>
     </w:p>
     <w:p>
@@ -377,7 +601,7 @@
       <w:tr>
         <w:trPr>
           <w:cantSplit/>
-          <w:trHeight w:val="460"/>
+          <w:trHeight w:val="420"/>
         </w:trPr>
         <w:tc>
           <w:tcPr>
@@ -431,7 +655,7 @@
       <w:tr>
         <w:trPr>
           <w:cantSplit/>
-          <w:trHeight w:val="460"/>
+          <w:trHeight w:val="420"/>
         </w:trPr>
         <w:tc>
           <w:tcPr>
@@ -485,7 +709,7 @@
       <w:tr>
         <w:trPr>
           <w:cantSplit/>
-          <w:trHeight w:val="460"/>
+          <w:trHeight w:val="420"/>
         </w:trPr>
         <w:tc>
           <w:tcPr>
@@ -539,7 +763,7 @@
       <w:tr>
         <w:trPr>
           <w:cantSplit/>
-          <w:trHeight w:val="460"/>
+          <w:trHeight w:val="420"/>
         </w:trPr>
         <w:tc>
           <w:tcPr>
@@ -751,7 +975,7 @@
       <w:tr>
         <w:trPr>
           <w:cantSplit/>
-          <w:trHeight w:val="280"/>
+          <w:trHeight w:val="250"/>
         </w:trPr>
         <w:tc>
           <w:tcPr>
@@ -785,7 +1009,7 @@
       <w:tr>
         <w:trPr>
           <w:cantSplit/>
-          <w:trHeight w:val="280"/>
+          <w:trHeight w:val="250"/>
         </w:trPr>
         <w:tc>
           <w:tcPr>
@@ -819,7 +1043,7 @@
       <w:tr>
         <w:trPr>
           <w:cantSplit/>
-          <w:trHeight w:val="280"/>
+          <w:trHeight w:val="250"/>
         </w:trPr>
         <w:tc>
           <w:tcPr>
@@ -853,7 +1077,7 @@
       <w:tr>
         <w:trPr>
           <w:cantSplit/>
-          <w:trHeight w:val="280"/>
+          <w:trHeight w:val="250"/>
         </w:trPr>
         <w:tc>
           <w:tcPr>
@@ -887,7 +1111,7 @@
       <w:tr>
         <w:trPr>
           <w:cantSplit/>
-          <w:trHeight w:val="280"/>
+          <w:trHeight w:val="250"/>
         </w:trPr>
         <w:tc>
           <w:tcPr>
@@ -921,7 +1145,7 @@
       <w:tr>
         <w:trPr>
           <w:cantSplit/>
-          <w:trHeight w:val="280"/>
+          <w:trHeight w:val="250"/>
         </w:trPr>
         <w:tc>
           <w:tcPr>
@@ -955,7 +1179,7 @@
       <w:tr>
         <w:trPr>
           <w:cantSplit/>
-          <w:trHeight w:val="280"/>
+          <w:trHeight w:val="250"/>
         </w:trPr>
         <w:tc>
           <w:tcPr>
@@ -989,7 +1213,7 @@
       <w:tr>
         <w:trPr>
           <w:cantSplit/>
-          <w:trHeight w:val="560"/>
+          <w:trHeight w:val="420"/>
         </w:trPr>
         <w:tc>
           <w:tcPr>
@@ -1003,7 +1227,7 @@
           </w:tcPr>
           <w:p>
             <w:r>
-              <w:t xml:space="preserve">If the syllabus covers more than one delivery method, what differs between them for the items above (oral communication, collaboration, and the points where students receive critical feedback)</w:t>
+              <w:t xml:space="preserve">Differences between delivery methods, if the syllabus covers more than one</w:t>
             </w:r>
           </w:p>
         </w:tc>

</xml_diff>

<commit_message>
Make the syllabus confirmation a check box
The line confirming that the syllabus carries the catalog course
description and the GEOC outcomes now leads with a box instead of
ending in a blank.
</commit_message>
<xml_diff>
--- a/committee/ccc/papers/geoc-alignment-form-proposed.docx
+++ b/committee/ccc/papers/geoc-alignment-form-proposed.docx
@@ -297,7 +297,13 @@
     </w:p>
     <w:p>
       <w:r>
-        <w:t xml:space="preserve">The attached syllabus carries the catalog course description, and the GEOC learning outcomes for every area named above  ____</w:t>
+        <w:rPr>
+          <w:rFonts w:ascii="Wingdings" w:hAnsi="Wingdings" w:cs="Wingdings"/>
+        </w:rPr>
+        <w:t>o</w:t>
+      </w:r>
+      <w:r>
+        <w:t xml:space="preserve">  The attached syllabus carries the catalog course description, and the GEOC learning outcomes for every area named above</w:t>
       </w:r>
     </w:p>
     <w:p/>

</xml_diff>

<commit_message>
Make the check boxes clickable in Word
All twenty-four boxes are now check box content controls rather
than typed characters. Clicking one toggles it between an empty
and a crossed box, with no document protection needed. Each
carries its own control id.
</commit_message>
<xml_diff>
--- a/committee/ccc/papers/geoc-alignment-form-proposed.docx
+++ b/committee/ccc/papers/geoc-alignment-form-proposed.docx
@@ -23,30 +23,66 @@
       <w:r>
         <w:t xml:space="preserve">Proposal type     </w:t>
       </w:r>
-      <w:r>
-        <w:rPr>
-          <w:rFonts w:ascii="Wingdings" w:hAnsi="Wingdings" w:cs="Wingdings"/>
-        </w:rPr>
-        <w:t>o</w:t>
-      </w:r>
+      <w:sdt>
+        <w:sdtPr>
+          <w:id w:val="900001"/>
+          <w14:checkbox>
+            <w14:checked w14:val="0"/>
+            <w14:checkedState w14:val="2612" w14:font="MS Gothic"/>
+            <w14:uncheckedState w14:val="2610" w14:font="MS Gothic"/>
+          </w14:checkbox>
+        </w:sdtPr>
+        <w:sdtContent>
+          <w:r>
+            <w:rPr>
+              <w:rFonts w:ascii="MS Gothic" w:eastAsia="MS Gothic" w:hAnsi="MS Gothic" w:cs="MS Gothic"/>
+            </w:rPr>
+            <w:t>☐</w:t>
+          </w:r>
+        </w:sdtContent>
+      </w:sdt>
       <w:r>
         <w:t xml:space="preserve">  Recertification      </w:t>
       </w:r>
-      <w:r>
-        <w:rPr>
-          <w:rFonts w:ascii="Wingdings" w:hAnsi="Wingdings" w:cs="Wingdings"/>
-        </w:rPr>
-        <w:t>o</w:t>
-      </w:r>
+      <w:sdt>
+        <w:sdtPr>
+          <w:id w:val="900002"/>
+          <w14:checkbox>
+            <w14:checked w14:val="0"/>
+            <w14:checkedState w14:val="2612" w14:font="MS Gothic"/>
+            <w14:uncheckedState w14:val="2610" w14:font="MS Gothic"/>
+          </w14:checkbox>
+        </w:sdtPr>
+        <w:sdtContent>
+          <w:r>
+            <w:rPr>
+              <w:rFonts w:ascii="MS Gothic" w:eastAsia="MS Gothic" w:hAnsi="MS Gothic" w:cs="MS Gothic"/>
+            </w:rPr>
+            <w:t>☐</w:t>
+          </w:r>
+        </w:sdtContent>
+      </w:sdt>
       <w:r>
         <w:t xml:space="preserve">  Revision only (not up for Recertification)      </w:t>
       </w:r>
-      <w:r>
-        <w:rPr>
-          <w:rFonts w:ascii="Wingdings" w:hAnsi="Wingdings" w:cs="Wingdings"/>
-        </w:rPr>
-        <w:t>o</w:t>
-      </w:r>
+      <w:sdt>
+        <w:sdtPr>
+          <w:id w:val="900003"/>
+          <w14:checkbox>
+            <w14:checked w14:val="0"/>
+            <w14:checkedState w14:val="2612" w14:font="MS Gothic"/>
+            <w14:uncheckedState w14:val="2610" w14:font="MS Gothic"/>
+          </w14:checkbox>
+        </w:sdtPr>
+        <w:sdtContent>
+          <w:r>
+            <w:rPr>
+              <w:rFonts w:ascii="MS Gothic" w:eastAsia="MS Gothic" w:hAnsi="MS Gothic" w:cs="MS Gothic"/>
+            </w:rPr>
+            <w:t>☐</w:t>
+          </w:r>
+        </w:sdtContent>
+      </w:sdt>
       <w:r>
         <w:t xml:space="preserve">  New course</w:t>
       </w:r>
@@ -65,102 +101,234 @@
       <w:r>
         <w:t xml:space="preserve">Lower division   </w:t>
       </w:r>
-      <w:r>
-        <w:rPr>
-          <w:rFonts w:ascii="Wingdings" w:hAnsi="Wingdings" w:cs="Wingdings"/>
-        </w:rPr>
-        <w:t>o</w:t>
-      </w:r>
+      <w:sdt>
+        <w:sdtPr>
+          <w:id w:val="900004"/>
+          <w14:checkbox>
+            <w14:checked w14:val="0"/>
+            <w14:checkedState w14:val="2612" w14:font="MS Gothic"/>
+            <w14:uncheckedState w14:val="2610" w14:font="MS Gothic"/>
+          </w14:checkbox>
+        </w:sdtPr>
+        <w:sdtContent>
+          <w:r>
+            <w:rPr>
+              <w:rFonts w:ascii="MS Gothic" w:eastAsia="MS Gothic" w:hAnsi="MS Gothic" w:cs="MS Gothic"/>
+            </w:rPr>
+            <w:t>☐</w:t>
+          </w:r>
+        </w:sdtContent>
+      </w:sdt>
       <w:r>
         <w:t xml:space="preserve">  1A   </w:t>
       </w:r>
-      <w:r>
-        <w:rPr>
-          <w:rFonts w:ascii="Wingdings" w:hAnsi="Wingdings" w:cs="Wingdings"/>
-        </w:rPr>
-        <w:t>o</w:t>
-      </w:r>
+      <w:sdt>
+        <w:sdtPr>
+          <w:id w:val="900005"/>
+          <w14:checkbox>
+            <w14:checked w14:val="0"/>
+            <w14:checkedState w14:val="2612" w14:font="MS Gothic"/>
+            <w14:uncheckedState w14:val="2610" w14:font="MS Gothic"/>
+          </w14:checkbox>
+        </w:sdtPr>
+        <w:sdtContent>
+          <w:r>
+            <w:rPr>
+              <w:rFonts w:ascii="MS Gothic" w:eastAsia="MS Gothic" w:hAnsi="MS Gothic" w:cs="MS Gothic"/>
+            </w:rPr>
+            <w:t>☐</w:t>
+          </w:r>
+        </w:sdtContent>
+      </w:sdt>
       <w:r>
         <w:t xml:space="preserve">  1B   </w:t>
       </w:r>
-      <w:r>
-        <w:rPr>
-          <w:rFonts w:ascii="Wingdings" w:hAnsi="Wingdings" w:cs="Wingdings"/>
-        </w:rPr>
-        <w:t>o</w:t>
-      </w:r>
+      <w:sdt>
+        <w:sdtPr>
+          <w:id w:val="900006"/>
+          <w14:checkbox>
+            <w14:checked w14:val="0"/>
+            <w14:checkedState w14:val="2612" w14:font="MS Gothic"/>
+            <w14:uncheckedState w14:val="2610" w14:font="MS Gothic"/>
+          </w14:checkbox>
+        </w:sdtPr>
+        <w:sdtContent>
+          <w:r>
+            <w:rPr>
+              <w:rFonts w:ascii="MS Gothic" w:eastAsia="MS Gothic" w:hAnsi="MS Gothic" w:cs="MS Gothic"/>
+            </w:rPr>
+            <w:t>☐</w:t>
+          </w:r>
+        </w:sdtContent>
+      </w:sdt>
       <w:r>
         <w:t xml:space="preserve">  1C   </w:t>
       </w:r>
-      <w:r>
-        <w:rPr>
-          <w:rFonts w:ascii="Wingdings" w:hAnsi="Wingdings" w:cs="Wingdings"/>
-        </w:rPr>
-        <w:t>o</w:t>
-      </w:r>
+      <w:sdt>
+        <w:sdtPr>
+          <w:id w:val="900007"/>
+          <w14:checkbox>
+            <w14:checked w14:val="0"/>
+            <w14:checkedState w14:val="2612" w14:font="MS Gothic"/>
+            <w14:uncheckedState w14:val="2610" w14:font="MS Gothic"/>
+          </w14:checkbox>
+        </w:sdtPr>
+        <w:sdtContent>
+          <w:r>
+            <w:rPr>
+              <w:rFonts w:ascii="MS Gothic" w:eastAsia="MS Gothic" w:hAnsi="MS Gothic" w:cs="MS Gothic"/>
+            </w:rPr>
+            <w:t>☐</w:t>
+          </w:r>
+        </w:sdtContent>
+      </w:sdt>
       <w:r>
         <w:t xml:space="preserve">  2   </w:t>
       </w:r>
-      <w:r>
-        <w:rPr>
-          <w:rFonts w:ascii="Wingdings" w:hAnsi="Wingdings" w:cs="Wingdings"/>
-        </w:rPr>
-        <w:t>o</w:t>
-      </w:r>
+      <w:sdt>
+        <w:sdtPr>
+          <w:id w:val="900008"/>
+          <w14:checkbox>
+            <w14:checked w14:val="0"/>
+            <w14:checkedState w14:val="2612" w14:font="MS Gothic"/>
+            <w14:uncheckedState w14:val="2610" w14:font="MS Gothic"/>
+          </w14:checkbox>
+        </w:sdtPr>
+        <w:sdtContent>
+          <w:r>
+            <w:rPr>
+              <w:rFonts w:ascii="MS Gothic" w:eastAsia="MS Gothic" w:hAnsi="MS Gothic" w:cs="MS Gothic"/>
+            </w:rPr>
+            <w:t>☐</w:t>
+          </w:r>
+        </w:sdtContent>
+      </w:sdt>
       <w:r>
         <w:t xml:space="preserve">  3A   </w:t>
       </w:r>
-      <w:r>
-        <w:rPr>
-          <w:rFonts w:ascii="Wingdings" w:hAnsi="Wingdings" w:cs="Wingdings"/>
-        </w:rPr>
-        <w:t>o</w:t>
-      </w:r>
+      <w:sdt>
+        <w:sdtPr>
+          <w:id w:val="900009"/>
+          <w14:checkbox>
+            <w14:checked w14:val="0"/>
+            <w14:checkedState w14:val="2612" w14:font="MS Gothic"/>
+            <w14:uncheckedState w14:val="2610" w14:font="MS Gothic"/>
+          </w14:checkbox>
+        </w:sdtPr>
+        <w:sdtContent>
+          <w:r>
+            <w:rPr>
+              <w:rFonts w:ascii="MS Gothic" w:eastAsia="MS Gothic" w:hAnsi="MS Gothic" w:cs="MS Gothic"/>
+            </w:rPr>
+            <w:t>☐</w:t>
+          </w:r>
+        </w:sdtContent>
+      </w:sdt>
       <w:r>
         <w:t xml:space="preserve">  3B   </w:t>
       </w:r>
-      <w:r>
-        <w:rPr>
-          <w:rFonts w:ascii="Wingdings" w:hAnsi="Wingdings" w:cs="Wingdings"/>
-        </w:rPr>
-        <w:t>o</w:t>
-      </w:r>
+      <w:sdt>
+        <w:sdtPr>
+          <w:id w:val="900010"/>
+          <w14:checkbox>
+            <w14:checked w14:val="0"/>
+            <w14:checkedState w14:val="2612" w14:font="MS Gothic"/>
+            <w14:uncheckedState w14:val="2610" w14:font="MS Gothic"/>
+          </w14:checkbox>
+        </w:sdtPr>
+        <w:sdtContent>
+          <w:r>
+            <w:rPr>
+              <w:rFonts w:ascii="MS Gothic" w:eastAsia="MS Gothic" w:hAnsi="MS Gothic" w:cs="MS Gothic"/>
+            </w:rPr>
+            <w:t>☐</w:t>
+          </w:r>
+        </w:sdtContent>
+      </w:sdt>
       <w:r>
         <w:t xml:space="preserve">  4   </w:t>
       </w:r>
-      <w:r>
-        <w:rPr>
-          <w:rFonts w:ascii="Wingdings" w:hAnsi="Wingdings" w:cs="Wingdings"/>
-        </w:rPr>
-        <w:t>o</w:t>
-      </w:r>
+      <w:sdt>
+        <w:sdtPr>
+          <w:id w:val="900011"/>
+          <w14:checkbox>
+            <w14:checked w14:val="0"/>
+            <w14:checkedState w14:val="2612" w14:font="MS Gothic"/>
+            <w14:uncheckedState w14:val="2610" w14:font="MS Gothic"/>
+          </w14:checkbox>
+        </w:sdtPr>
+        <w:sdtContent>
+          <w:r>
+            <w:rPr>
+              <w:rFonts w:ascii="MS Gothic" w:eastAsia="MS Gothic" w:hAnsi="MS Gothic" w:cs="MS Gothic"/>
+            </w:rPr>
+            <w:t>☐</w:t>
+          </w:r>
+        </w:sdtContent>
+      </w:sdt>
       <w:r>
         <w:t xml:space="preserve">  5A   </w:t>
       </w:r>
-      <w:r>
-        <w:rPr>
-          <w:rFonts w:ascii="Wingdings" w:hAnsi="Wingdings" w:cs="Wingdings"/>
-        </w:rPr>
-        <w:t>o</w:t>
-      </w:r>
+      <w:sdt>
+        <w:sdtPr>
+          <w:id w:val="900012"/>
+          <w14:checkbox>
+            <w14:checked w14:val="0"/>
+            <w14:checkedState w14:val="2612" w14:font="MS Gothic"/>
+            <w14:uncheckedState w14:val="2610" w14:font="MS Gothic"/>
+          </w14:checkbox>
+        </w:sdtPr>
+        <w:sdtContent>
+          <w:r>
+            <w:rPr>
+              <w:rFonts w:ascii="MS Gothic" w:eastAsia="MS Gothic" w:hAnsi="MS Gothic" w:cs="MS Gothic"/>
+            </w:rPr>
+            <w:t>☐</w:t>
+          </w:r>
+        </w:sdtContent>
+      </w:sdt>
       <w:r>
         <w:t xml:space="preserve">  5B   </w:t>
       </w:r>
-      <w:r>
-        <w:rPr>
-          <w:rFonts w:ascii="Wingdings" w:hAnsi="Wingdings" w:cs="Wingdings"/>
-        </w:rPr>
-        <w:t>o</w:t>
-      </w:r>
+      <w:sdt>
+        <w:sdtPr>
+          <w:id w:val="900013"/>
+          <w14:checkbox>
+            <w14:checked w14:val="0"/>
+            <w14:checkedState w14:val="2612" w14:font="MS Gothic"/>
+            <w14:uncheckedState w14:val="2610" w14:font="MS Gothic"/>
+          </w14:checkbox>
+        </w:sdtPr>
+        <w:sdtContent>
+          <w:r>
+            <w:rPr>
+              <w:rFonts w:ascii="MS Gothic" w:eastAsia="MS Gothic" w:hAnsi="MS Gothic" w:cs="MS Gothic"/>
+            </w:rPr>
+            <w:t>☐</w:t>
+          </w:r>
+        </w:sdtContent>
+      </w:sdt>
       <w:r>
         <w:t xml:space="preserve">  5C   </w:t>
       </w:r>
-      <w:r>
-        <w:rPr>
-          <w:rFonts w:ascii="Wingdings" w:hAnsi="Wingdings" w:cs="Wingdings"/>
-        </w:rPr>
-        <w:t>o</w:t>
-      </w:r>
+      <w:sdt>
+        <w:sdtPr>
+          <w:id w:val="900014"/>
+          <w14:checkbox>
+            <w14:checked w14:val="0"/>
+            <w14:checkedState w14:val="2612" w14:font="MS Gothic"/>
+            <w14:uncheckedState w14:val="2610" w14:font="MS Gothic"/>
+          </w14:checkbox>
+        </w:sdtPr>
+        <w:sdtContent>
+          <w:r>
+            <w:rPr>
+              <w:rFonts w:ascii="MS Gothic" w:eastAsia="MS Gothic" w:hAnsi="MS Gothic" w:cs="MS Gothic"/>
+            </w:rPr>
+            <w:t>☐</w:t>
+          </w:r>
+        </w:sdtContent>
+      </w:sdt>
       <w:r>
         <w:t xml:space="preserve">  6   </w:t>
       </w:r>
@@ -169,30 +337,66 @@
       <w:r>
         <w:t xml:space="preserve">Upper division   </w:t>
       </w:r>
-      <w:r>
-        <w:rPr>
-          <w:rFonts w:ascii="Wingdings" w:hAnsi="Wingdings" w:cs="Wingdings"/>
-        </w:rPr>
-        <w:t>o</w:t>
-      </w:r>
+      <w:sdt>
+        <w:sdtPr>
+          <w:id w:val="900015"/>
+          <w14:checkbox>
+            <w14:checked w14:val="0"/>
+            <w14:checkedState w14:val="2612" w14:font="MS Gothic"/>
+            <w14:uncheckedState w14:val="2610" w14:font="MS Gothic"/>
+          </w14:checkbox>
+        </w:sdtPr>
+        <w:sdtContent>
+          <w:r>
+            <w:rPr>
+              <w:rFonts w:ascii="MS Gothic" w:eastAsia="MS Gothic" w:hAnsi="MS Gothic" w:cs="MS Gothic"/>
+            </w:rPr>
+            <w:t>☐</w:t>
+          </w:r>
+        </w:sdtContent>
+      </w:sdt>
       <w:r>
         <w:t xml:space="preserve">  UD-3   </w:t>
       </w:r>
-      <w:r>
-        <w:rPr>
-          <w:rFonts w:ascii="Wingdings" w:hAnsi="Wingdings" w:cs="Wingdings"/>
-        </w:rPr>
-        <w:t>o</w:t>
-      </w:r>
+      <w:sdt>
+        <w:sdtPr>
+          <w:id w:val="900016"/>
+          <w14:checkbox>
+            <w14:checked w14:val="0"/>
+            <w14:checkedState w14:val="2612" w14:font="MS Gothic"/>
+            <w14:uncheckedState w14:val="2610" w14:font="MS Gothic"/>
+          </w14:checkbox>
+        </w:sdtPr>
+        <w:sdtContent>
+          <w:r>
+            <w:rPr>
+              <w:rFonts w:ascii="MS Gothic" w:eastAsia="MS Gothic" w:hAnsi="MS Gothic" w:cs="MS Gothic"/>
+            </w:rPr>
+            <w:t>☐</w:t>
+          </w:r>
+        </w:sdtContent>
+      </w:sdt>
       <w:r>
         <w:t xml:space="preserve">  UD-4   </w:t>
       </w:r>
-      <w:r>
-        <w:rPr>
-          <w:rFonts w:ascii="Wingdings" w:hAnsi="Wingdings" w:cs="Wingdings"/>
-        </w:rPr>
-        <w:t>o</w:t>
-      </w:r>
+      <w:sdt>
+        <w:sdtPr>
+          <w:id w:val="900017"/>
+          <w14:checkbox>
+            <w14:checked w14:val="0"/>
+            <w14:checkedState w14:val="2612" w14:font="MS Gothic"/>
+            <w14:uncheckedState w14:val="2610" w14:font="MS Gothic"/>
+          </w14:checkbox>
+        </w:sdtPr>
+        <w:sdtContent>
+          <w:r>
+            <w:rPr>
+              <w:rFonts w:ascii="MS Gothic" w:eastAsia="MS Gothic" w:hAnsi="MS Gothic" w:cs="MS Gothic"/>
+            </w:rPr>
+            <w:t>☐</w:t>
+          </w:r>
+        </w:sdtContent>
+      </w:sdt>
       <w:r>
         <w:t xml:space="preserve">  UD-5   </w:t>
       </w:r>
@@ -201,60 +405,132 @@
       <w:r>
         <w:t xml:space="preserve">Overlay   </w:t>
       </w:r>
-      <w:r>
-        <w:rPr>
-          <w:rFonts w:ascii="Wingdings" w:hAnsi="Wingdings" w:cs="Wingdings"/>
-        </w:rPr>
-        <w:t>o</w:t>
-      </w:r>
+      <w:sdt>
+        <w:sdtPr>
+          <w:id w:val="900018"/>
+          <w14:checkbox>
+            <w14:checked w14:val="0"/>
+            <w14:checkedState w14:val="2612" w14:font="MS Gothic"/>
+            <w14:uncheckedState w14:val="2610" w14:font="MS Gothic"/>
+          </w14:checkbox>
+        </w:sdtPr>
+        <w:sdtContent>
+          <w:r>
+            <w:rPr>
+              <w:rFonts w:ascii="MS Gothic" w:eastAsia="MS Gothic" w:hAnsi="MS Gothic" w:cs="MS Gothic"/>
+            </w:rPr>
+            <w:t>☐</w:t>
+          </w:r>
+        </w:sdtContent>
+      </w:sdt>
       <w:r>
         <w:t xml:space="preserve">  Diversity   </w:t>
       </w:r>
-      <w:r>
-        <w:rPr>
-          <w:rFonts w:ascii="Wingdings" w:hAnsi="Wingdings" w:cs="Wingdings"/>
-        </w:rPr>
-        <w:t>o</w:t>
-      </w:r>
+      <w:sdt>
+        <w:sdtPr>
+          <w:id w:val="900019"/>
+          <w14:checkbox>
+            <w14:checked w14:val="0"/>
+            <w14:checkedState w14:val="2612" w14:font="MS Gothic"/>
+            <w14:uncheckedState w14:val="2610" w14:font="MS Gothic"/>
+          </w14:checkbox>
+        </w:sdtPr>
+        <w:sdtContent>
+          <w:r>
+            <w:rPr>
+              <w:rFonts w:ascii="MS Gothic" w:eastAsia="MS Gothic" w:hAnsi="MS Gothic" w:cs="MS Gothic"/>
+            </w:rPr>
+            <w:t>☐</w:t>
+          </w:r>
+        </w:sdtContent>
+      </w:sdt>
       <w:r>
         <w:t xml:space="preserve">  Social Justice   </w:t>
       </w:r>
-      <w:r>
-        <w:rPr>
-          <w:rFonts w:ascii="Wingdings" w:hAnsi="Wingdings" w:cs="Wingdings"/>
-        </w:rPr>
-        <w:t>o</w:t>
-      </w:r>
+      <w:sdt>
+        <w:sdtPr>
+          <w:id w:val="900020"/>
+          <w14:checkbox>
+            <w14:checked w14:val="0"/>
+            <w14:checkedState w14:val="2612" w14:font="MS Gothic"/>
+            <w14:uncheckedState w14:val="2610" w14:font="MS Gothic"/>
+          </w14:checkbox>
+        </w:sdtPr>
+        <w:sdtContent>
+          <w:r>
+            <w:rPr>
+              <w:rFonts w:ascii="MS Gothic" w:eastAsia="MS Gothic" w:hAnsi="MS Gothic" w:cs="MS Gothic"/>
+            </w:rPr>
+            <w:t>☐</w:t>
+          </w:r>
+        </w:sdtContent>
+      </w:sdt>
       <w:r>
         <w:t xml:space="preserve">  Sustainability   </w:t>
       </w:r>
       <w:r>
         <w:t xml:space="preserve">    Code   </w:t>
       </w:r>
-      <w:r>
-        <w:rPr>
-          <w:rFonts w:ascii="Wingdings" w:hAnsi="Wingdings" w:cs="Wingdings"/>
-        </w:rPr>
-        <w:t>o</w:t>
-      </w:r>
+      <w:sdt>
+        <w:sdtPr>
+          <w:id w:val="900021"/>
+          <w14:checkbox>
+            <w14:checked w14:val="0"/>
+            <w14:checkedState w14:val="2612" w14:font="MS Gothic"/>
+            <w14:uncheckedState w14:val="2610" w14:font="MS Gothic"/>
+          </w14:checkbox>
+        </w:sdtPr>
+        <w:sdtContent>
+          <w:r>
+            <w:rPr>
+              <w:rFonts w:ascii="MS Gothic" w:eastAsia="MS Gothic" w:hAnsi="MS Gothic" w:cs="MS Gothic"/>
+            </w:rPr>
+            <w:t>☐</w:t>
+          </w:r>
+        </w:sdtContent>
+      </w:sdt>
       <w:r>
         <w:t xml:space="preserve">  US-1   </w:t>
       </w:r>
-      <w:r>
-        <w:rPr>
-          <w:rFonts w:ascii="Wingdings" w:hAnsi="Wingdings" w:cs="Wingdings"/>
-        </w:rPr>
-        <w:t>o</w:t>
-      </w:r>
+      <w:sdt>
+        <w:sdtPr>
+          <w:id w:val="900022"/>
+          <w14:checkbox>
+            <w14:checked w14:val="0"/>
+            <w14:checkedState w14:val="2612" w14:font="MS Gothic"/>
+            <w14:uncheckedState w14:val="2610" w14:font="MS Gothic"/>
+          </w14:checkbox>
+        </w:sdtPr>
+        <w:sdtContent>
+          <w:r>
+            <w:rPr>
+              <w:rFonts w:ascii="MS Gothic" w:eastAsia="MS Gothic" w:hAnsi="MS Gothic" w:cs="MS Gothic"/>
+            </w:rPr>
+            <w:t>☐</w:t>
+          </w:r>
+        </w:sdtContent>
+      </w:sdt>
       <w:r>
         <w:t xml:space="preserve">  US-2   </w:t>
       </w:r>
-      <w:r>
-        <w:rPr>
-          <w:rFonts w:ascii="Wingdings" w:hAnsi="Wingdings" w:cs="Wingdings"/>
-        </w:rPr>
-        <w:t>o</w:t>
-      </w:r>
+      <w:sdt>
+        <w:sdtPr>
+          <w:id w:val="900023"/>
+          <w14:checkbox>
+            <w14:checked w14:val="0"/>
+            <w14:checkedState w14:val="2612" w14:font="MS Gothic"/>
+            <w14:uncheckedState w14:val="2610" w14:font="MS Gothic"/>
+          </w14:checkbox>
+        </w:sdtPr>
+        <w:sdtContent>
+          <w:r>
+            <w:rPr>
+              <w:rFonts w:ascii="MS Gothic" w:eastAsia="MS Gothic" w:hAnsi="MS Gothic" w:cs="MS Gothic"/>
+            </w:rPr>
+            <w:t>☐</w:t>
+          </w:r>
+        </w:sdtContent>
+      </w:sdt>
       <w:r>
         <w:t xml:space="preserve">  US-3   </w:t>
       </w:r>
@@ -296,12 +572,24 @@
       </w:r>
     </w:p>
     <w:p>
-      <w:r>
-        <w:rPr>
-          <w:rFonts w:ascii="Wingdings" w:hAnsi="Wingdings" w:cs="Wingdings"/>
-        </w:rPr>
-        <w:t>o</w:t>
-      </w:r>
+      <w:sdt>
+        <w:sdtPr>
+          <w:id w:val="900024"/>
+          <w14:checkbox>
+            <w14:checked w14:val="0"/>
+            <w14:checkedState w14:val="2612" w14:font="MS Gothic"/>
+            <w14:uncheckedState w14:val="2610" w14:font="MS Gothic"/>
+          </w14:checkbox>
+        </w:sdtPr>
+        <w:sdtContent>
+          <w:r>
+            <w:rPr>
+              <w:rFonts w:ascii="MS Gothic" w:eastAsia="MS Gothic" w:hAnsi="MS Gothic" w:cs="MS Gothic"/>
+            </w:rPr>
+            <w:t>☐</w:t>
+          </w:r>
+        </w:sdtContent>
+      </w:sdt>
       <w:r>
         <w:t xml:space="preserve">  The attached syllabus carries the catalog course description, and the GEOC learning outcomes for every area named above</w:t>
       </w:r>

</xml_diff>

<commit_message>
Drop the enrollment cap row
A syllabus does not state the enrollment cap, so the row had no
answerable entry. The framework puts cap monitoring with the GE
Director each term, and Curriculog Section 2e already has the
department chair certify that faculty are given the cap.
</commit_message>
<xml_diff>
--- a/committee/ccc/papers/geoc-alignment-form-proposed.docx
+++ b/committee/ccc/papers/geoc-alignment-form-proposed.docx
@@ -1284,40 +1284,6 @@
           <w:p>
             <w:r>
               <w:t xml:space="preserve">Total assigned words, and the assignments that reach it</w:t>
-            </w:r>
-          </w:p>
-        </w:tc>
-        <w:tc>
-          <w:tcPr>
-            <w:tcW w:w="6120" w:type="dxa"/>
-            <w:tcBorders>
-              <w:top w:val="single" w:sz="4" w:space="0" w:color="000000"/>
-              <w:left w:val="single" w:sz="4" w:space="0" w:color="000000"/>
-              <w:bottom w:val="single" w:sz="4" w:space="0" w:color="000000"/>
-              <w:right w:val="single" w:sz="4" w:space="0" w:color="000000"/>
-            </w:tcBorders>
-          </w:tcPr>
-          <w:p/>
-        </w:tc>
-      </w:tr>
-      <w:tr>
-        <w:trPr>
-          <w:cantSplit/>
-          <w:trHeight w:val="250"/>
-        </w:trPr>
-        <w:tc>
-          <w:tcPr>
-            <w:tcW w:w="3330" w:type="dxa"/>
-            <w:tcBorders>
-              <w:top w:val="single" w:sz="4" w:space="0" w:color="000000"/>
-              <w:left w:val="single" w:sz="4" w:space="0" w:color="000000"/>
-              <w:bottom w:val="single" w:sz="4" w:space="0" w:color="000000"/>
-              <w:right w:val="single" w:sz="4" w:space="0" w:color="000000"/>
-            </w:tcBorders>
-          </w:tcPr>
-          <w:p>
-            <w:r>
-              <w:t xml:space="preserve">Enrollment cap</w:t>
             </w:r>
           </w:p>
         </w:tc>

</xml_diff>

<commit_message>
Use GEOC's own method for course characteristics
Section 2 no longer names six characteristics. The left column is
blank and the filer pastes each characteristic for their areas
from the GE Framework, shortening it if they wish, then gives the
assignment and where it sits on the syllabus. This is how the
original form handles characteristics, and it fits every area
without a catch-all row.

Section renamed to course characteristics and delivery, since the
delivery row sits at the bottom of the same table.
</commit_message>
<xml_diff>
--- a/committee/ccc/papers/geoc-alignment-form-proposed.docx
+++ b/committee/ccc/papers/geoc-alignment-form-proposed.docx
@@ -1150,7 +1150,7 @@
                 <w:sz w:val="21"/>
                 <w:szCs w:val="21"/>
               </w:rPr>
-              <w:t xml:space="preserve">Course characteristics</w:t>
+              <w:t xml:space="preserve">Course characteristics and delivery</w:t>
             </w:r>
           </w:p>
         </w:tc>
@@ -1188,7 +1188,14 @@
           </w:tcPr>
           <w:p>
             <w:r>
-              <w:t xml:space="preserve">Complete only the characteristics that apply to the areas named above. Give the assignment and where it sits on the syllabus. Write n/a for the rest.</w:t>
+              <w:t xml:space="preserve">Paste each course characteristic for the areas named above, taken from the current GE Framework. You may give a shortened description. Then give the assignment and where it sits on the syllabus. </w:t>
+            </w:r>
+            <w:r>
+              <w:rPr>
+                <w:i/>
+                <w:iCs/>
+              </w:rPr>
+              <w:t xml:space="preserve">(Add rows as needed.)</w:t>
             </w:r>
           </w:p>
         </w:tc>
@@ -1261,7 +1268,7 @@
                 <w:b/>
                 <w:bCs/>
               </w:rPr>
-              <w:t xml:space="preserve">Where the syllabus meets it</w:t>
+              <w:t xml:space="preserve">Assignment, and where it sits on the syllabus</w:t>
             </w:r>
           </w:p>
         </w:tc>
@@ -1269,7 +1276,7 @@
       <w:tr>
         <w:trPr>
           <w:cantSplit/>
-          <w:trHeight w:val="250"/>
+          <w:trHeight w:val="380"/>
         </w:trPr>
         <w:tc>
           <w:tcPr>
@@ -1281,11 +1288,7 @@
               <w:right w:val="single" w:sz="4" w:space="0" w:color="000000"/>
             </w:tcBorders>
           </w:tcPr>
-          <w:p>
-            <w:r>
-              <w:t xml:space="preserve">Total assigned words, and the assignments that reach it</w:t>
-            </w:r>
-          </w:p>
+          <w:p/>
         </w:tc>
         <w:tc>
           <w:tcPr>
@@ -1303,7 +1306,7 @@
       <w:tr>
         <w:trPr>
           <w:cantSplit/>
-          <w:trHeight w:val="250"/>
+          <w:trHeight w:val="380"/>
         </w:trPr>
         <w:tc>
           <w:tcPr>
@@ -1315,11 +1318,7 @@
               <w:right w:val="single" w:sz="4" w:space="0" w:color="000000"/>
             </w:tcBorders>
           </w:tcPr>
-          <w:p>
-            <w:r>
-              <w:t xml:space="preserve">Collaboration or teamwork</w:t>
-            </w:r>
-          </w:p>
+          <w:p/>
         </w:tc>
         <w:tc>
           <w:tcPr>
@@ -1337,7 +1336,7 @@
       <w:tr>
         <w:trPr>
           <w:cantSplit/>
-          <w:trHeight w:val="250"/>
+          <w:trHeight w:val="380"/>
         </w:trPr>
         <w:tc>
           <w:tcPr>
@@ -1349,11 +1348,7 @@
               <w:right w:val="single" w:sz="4" w:space="0" w:color="000000"/>
             </w:tcBorders>
           </w:tcPr>
-          <w:p>
-            <w:r>
-              <w:t xml:space="preserve">Points where the instructor returns critical feedback</w:t>
-            </w:r>
-          </w:p>
+          <w:p/>
         </w:tc>
         <w:tc>
           <w:tcPr>
@@ -1371,7 +1366,7 @@
       <w:tr>
         <w:trPr>
           <w:cantSplit/>
-          <w:trHeight w:val="250"/>
+          <w:trHeight w:val="380"/>
         </w:trPr>
         <w:tc>
           <w:tcPr>
@@ -1383,11 +1378,7 @@
               <w:right w:val="single" w:sz="4" w:space="0" w:color="000000"/>
             </w:tcBorders>
           </w:tcPr>
-          <w:p>
-            <w:r>
-              <w:t xml:space="preserve">Oral communication</w:t>
-            </w:r>
-          </w:p>
+          <w:p/>
         </w:tc>
         <w:tc>
           <w:tcPr>
@@ -1405,7 +1396,7 @@
       <w:tr>
         <w:trPr>
           <w:cantSplit/>
-          <w:trHeight w:val="250"/>
+          <w:trHeight w:val="380"/>
         </w:trPr>
         <w:tc>
           <w:tcPr>
@@ -1417,45 +1408,7 @@
               <w:right w:val="single" w:sz="4" w:space="0" w:color="000000"/>
             </w:tcBorders>
           </w:tcPr>
-          <w:p>
-            <w:r>
-              <w:t xml:space="preserve">Information literacy</w:t>
-            </w:r>
-          </w:p>
-        </w:tc>
-        <w:tc>
-          <w:tcPr>
-            <w:tcW w:w="6120" w:type="dxa"/>
-            <w:tcBorders>
-              <w:top w:val="single" w:sz="4" w:space="0" w:color="000000"/>
-              <w:left w:val="single" w:sz="4" w:space="0" w:color="000000"/>
-              <w:bottom w:val="single" w:sz="4" w:space="0" w:color="000000"/>
-              <w:right w:val="single" w:sz="4" w:space="0" w:color="000000"/>
-            </w:tcBorders>
-          </w:tcPr>
           <w:p/>
-        </w:tc>
-      </w:tr>
-      <w:tr>
-        <w:trPr>
-          <w:cantSplit/>
-          <w:trHeight w:val="250"/>
-        </w:trPr>
-        <w:tc>
-          <w:tcPr>
-            <w:tcW w:w="3330" w:type="dxa"/>
-            <w:tcBorders>
-              <w:top w:val="single" w:sz="4" w:space="0" w:color="000000"/>
-              <w:left w:val="single" w:sz="4" w:space="0" w:color="000000"/>
-              <w:bottom w:val="single" w:sz="4" w:space="0" w:color="000000"/>
-              <w:right w:val="single" w:sz="4" w:space="0" w:color="000000"/>
-            </w:tcBorders>
-          </w:tcPr>
-          <w:p>
-            <w:r>
-              <w:t xml:space="preserve">Any other characteristic required for this area</w:t>
-            </w:r>
-          </w:p>
         </w:tc>
         <w:tc>
           <w:tcPr>

</xml_diff>

<commit_message>
Make the form work for every breadth tag
Added check boxes for Second Composition and W, the university
writing requirement. With 1A through 6, UD-3 through UD-5, the
three overlays, and US-1 through US-3 already present, the form
now covers every area the syllabus policy counts as breadth.

Course characteristics are not always assignments: 1A and Area 2
require a support class, online 1C a synchronous minimum, Area 6
the Ethnic Studies pedagogies and the prefix rule, 5C laboratory
safety. The second column now asks how and where the syllabus
meets the characteristic, and the instruction covers an
arrangement as well as an assignment.

3A, 3B, Area 4, 5A, 5B, the overlays, and the Code areas carry no
course characteristics in the framework, so the instruction says
to write none.
</commit_message>
<xml_diff>
--- a/committee/ccc/papers/geoc-alignment-form-proposed.docx
+++ b/committee/ccc/papers/geoc-alignment-form-proposed.docx
@@ -537,6 +537,53 @@
     </w:p>
     <w:p>
       <w:r>
+        <w:t xml:space="preserve">Writing   </w:t>
+      </w:r>
+      <w:sdt>
+        <w:sdtPr>
+          <w:id w:val="900024"/>
+          <w14:checkbox>
+            <w14:checked w14:val="0"/>
+            <w14:checkedState w14:val="2612" w14:font="MS Gothic"/>
+            <w14:uncheckedState w14:val="2610" w14:font="MS Gothic"/>
+          </w14:checkbox>
+        </w:sdtPr>
+        <w:sdtContent>
+          <w:r>
+            <w:rPr>
+              <w:rFonts w:ascii="MS Gothic" w:eastAsia="MS Gothic" w:hAnsi="MS Gothic" w:cs="MS Gothic"/>
+            </w:rPr>
+            <w:t>☐</w:t>
+          </w:r>
+        </w:sdtContent>
+      </w:sdt>
+      <w:r>
+        <w:t xml:space="preserve">  Second Composition   </w:t>
+      </w:r>
+      <w:sdt>
+        <w:sdtPr>
+          <w:id w:val="900025"/>
+          <w14:checkbox>
+            <w14:checked w14:val="0"/>
+            <w14:checkedState w14:val="2612" w14:font="MS Gothic"/>
+            <w14:uncheckedState w14:val="2610" w14:font="MS Gothic"/>
+          </w14:checkbox>
+        </w:sdtPr>
+        <w:sdtContent>
+          <w:r>
+            <w:rPr>
+              <w:rFonts w:ascii="MS Gothic" w:eastAsia="MS Gothic" w:hAnsi="MS Gothic" w:cs="MS Gothic"/>
+            </w:rPr>
+            <w:t>☐</w:t>
+          </w:r>
+        </w:sdtContent>
+      </w:sdt>
+      <w:r>
+        <w:t xml:space="preserve">  W (University Writing Requirement)   </w:t>
+      </w:r>
+    </w:p>
+    <w:p>
+      <w:r>
         <w:rPr>
           <w:i/>
           <w:iCs/>
@@ -574,7 +621,7 @@
     <w:p>
       <w:sdt>
         <w:sdtPr>
-          <w:id w:val="900024"/>
+          <w:id w:val="900026"/>
           <w14:checkbox>
             <w14:checked w14:val="0"/>
             <w14:checkedState w14:val="2612" w14:font="MS Gothic"/>
@@ -1188,7 +1235,7 @@
           </w:tcPr>
           <w:p>
             <w:r>
-              <w:t xml:space="preserve">Paste each course characteristic for the areas named above, taken from the current GE Framework. You may give a shortened description. Then give the assignment and where it sits on the syllabus. </w:t>
+              <w:t xml:space="preserve">Paste each course characteristic for the areas named above, taken from the current GE Framework. You may give a shortened description. Then give the assignment, or the arrangement, and where it sits on the syllabus. Where an area carries no course characteristics, write none. </w:t>
             </w:r>
             <w:r>
               <w:rPr>
@@ -1268,39 +1315,9 @@
                 <w:b/>
                 <w:bCs/>
               </w:rPr>
-              <w:t xml:space="preserve">Assignment, and where it sits on the syllabus</w:t>
+              <w:t xml:space="preserve">How and where the syllabus meets it</w:t>
             </w:r>
           </w:p>
-        </w:tc>
-      </w:tr>
-      <w:tr>
-        <w:trPr>
-          <w:cantSplit/>
-          <w:trHeight w:val="380"/>
-        </w:trPr>
-        <w:tc>
-          <w:tcPr>
-            <w:tcW w:w="3330" w:type="dxa"/>
-            <w:tcBorders>
-              <w:top w:val="single" w:sz="4" w:space="0" w:color="000000"/>
-              <w:left w:val="single" w:sz="4" w:space="0" w:color="000000"/>
-              <w:bottom w:val="single" w:sz="4" w:space="0" w:color="000000"/>
-              <w:right w:val="single" w:sz="4" w:space="0" w:color="000000"/>
-            </w:tcBorders>
-          </w:tcPr>
-          <w:p/>
-        </w:tc>
-        <w:tc>
-          <w:tcPr>
-            <w:tcW w:w="6120" w:type="dxa"/>
-            <w:tcBorders>
-              <w:top w:val="single" w:sz="4" w:space="0" w:color="000000"/>
-              <w:left w:val="single" w:sz="4" w:space="0" w:color="000000"/>
-              <w:bottom w:val="single" w:sz="4" w:space="0" w:color="000000"/>
-              <w:right w:val="single" w:sz="4" w:space="0" w:color="000000"/>
-            </w:tcBorders>
-          </w:tcPr>
-          <w:p/>
         </w:tc>
       </w:tr>
       <w:tr>

</xml_diff>

<commit_message>
State the Area 6 three-of-five rule, and correct the UD 5 label
Section 1 asks for the three outcomes an Area 6 course meets, with
a small italic note beneath the instruction recording the rule and
that the three are published on the syllabus.

Upper division science is UD 5.
</commit_message>
<xml_diff>
--- a/committee/ccc/papers/geoc-alignment-form-proposed.docx
+++ b/committee/ccc/papers/geoc-alignment-form-proposed.docx
@@ -398,7 +398,7 @@
         </w:sdtContent>
       </w:sdt>
       <w:r>
-        <w:t xml:space="preserve">  UD-5   </w:t>
+        <w:t xml:space="preserve">  UD 5   </w:t>
       </w:r>
     </w:p>
     <w:p>
@@ -739,7 +739,7 @@
           </w:tcPr>
           <w:p>
             <w:r>
-              <w:t xml:space="preserve">One row for each GEOC learning outcome in the areas named above, overlays included, copied in full from the current GE Framework. For Area 6, give the outcomes the course is certified for. Then give the weeks in which the outcome is taught, what students do in those weeks, and the assignment in which they demonstrate it. One or two sentences to a cell. </w:t>
+              <w:t xml:space="preserve">One row for each GEOC learning outcome in the areas named above, overlays included, copied in full from the current GE Framework. For Area 6, give the three outcomes the course meets. Then give the weeks in which the outcome is taught, what students do in those weeks, and the assignment in which they demonstrate it. One or two sentences to a cell. </w:t>
             </w:r>
             <w:r>
               <w:rPr>
@@ -747,6 +747,17 @@
                 <w:iCs/>
               </w:rPr>
               <w:t xml:space="preserve">(Add rows as needed.)</w:t>
+            </w:r>
+          </w:p>
+          <w:p>
+            <w:r>
+              <w:rPr>
+                <w:i/>
+                <w:iCs/>
+                <w:sz w:val="14"/>
+                <w:szCs w:val="14"/>
+              </w:rPr>
+              <w:t xml:space="preserve">An Area 6 course meets three of the five Area 6 learning outcomes, and the three it meets are published on the course syllabus.</w:t>
             </w:r>
           </w:p>
         </w:tc>

</xml_diff>

<commit_message>
Ask for the areas the proposal requests, and restore delivery methods as its own section
The area prompt read as though the areas were already approved,
which holds only for a recertification. It now asks for the area
or areas the proposal is for.

The note under the boxes points to the GE Framework document for
the current list of areas.

Delivery methods is section 3 again, since it is not a course
characteristic. The header line naming the delivery methods on the
attached syllabus is gone, covered by that section.

Both add-rows notes now say how: click in the last cell of the
table and press Tab.

Section headings, their spacer, and their instruction carry
keepNext, so a section moves to the next page as a unit.
</commit_message>
<xml_diff>
--- a/committee/ccc/papers/geoc-alignment-form-proposed.docx
+++ b/committee/ccc/papers/geoc-alignment-form-proposed.docx
@@ -94,7 +94,7 @@
     </w:p>
     <w:p>
       <w:r>
-        <w:t xml:space="preserve">GE/Overlay/Code Area for this course, as approved in Curriculog under Current Breadth Area(s) Approved:</w:t>
+        <w:t xml:space="preserve">GE/Overlay/Code area or areas this proposal is for:</w:t>
       </w:r>
     </w:p>
     <w:p>
@@ -588,16 +588,16 @@
           <w:i/>
           <w:iCs/>
         </w:rPr>
-        <w:t xml:space="preserve">Areas were relabeled for Fall 2025. The </w:t>
-      </w:r>
-      <w:hyperlink r:id="rId20" w:history="1">
+        <w:t xml:space="preserve">Current list of GE areas can be found in the </w:t>
+      </w:r>
+      <w:hyperlink r:id="rId5" w:history="1">
         <w:r>
           <w:rPr>
             <w:rStyle w:val="Hyperlink"/>
             <w:i/>
             <w:iCs/>
           </w:rPr>
-          <w:t>GE Guide</w:t>
+          <w:t>GE Framework document</w:t>
         </w:r>
       </w:hyperlink>
       <w:r>
@@ -605,12 +605,7 @@
           <w:i/>
           <w:iCs/>
         </w:rPr>
-        <w:t xml:space="preserve"> lists the current labels alongside the former ones.</w:t>
-      </w:r>
-    </w:p>
-    <w:p>
-      <w:r>
-        <w:t xml:space="preserve">Delivery methods on the attached syllabus ____________________________________</w:t>
+        <w:t xml:space="preserve">.</w:t>
       </w:r>
     </w:p>
     <w:p>
@@ -720,6 +715,7 @@
           </w:tcPr>
           <w:p>
             <w:pPr>
+              <w:keepNext/>
               <w:rPr>
                 <w:sz w:val="8"/>
                 <w:szCs w:val="8"/>
@@ -738,6 +734,9 @@
             <w:gridSpan w:val="4"/>
           </w:tcPr>
           <w:p>
+            <w:pPr>
+              <w:keepNext/>
+            </w:pPr>
             <w:r>
               <w:t xml:space="preserve">One row for each GEOC learning outcome in the areas named above, overlays included, copied in full from the current GE Framework. For Area 6, give the three outcomes the course meets. Then give the weeks in which the outcome is taught, what students do in those weeks, and the assignment in which they demonstrate it. One or two sentences to a cell. </w:t>
             </w:r>
@@ -746,10 +745,13 @@
                 <w:i/>
                 <w:iCs/>
               </w:rPr>
-              <w:t xml:space="preserve">(Add rows as needed.)</w:t>
+              <w:t xml:space="preserve">(Add rows as needed: click in the last cell of the table and press Tab.)</w:t>
             </w:r>
           </w:p>
           <w:p>
+            <w:pPr>
+              <w:keepNext/>
+            </w:pPr>
             <w:r>
               <w:rPr>
                 <w:i/>
@@ -776,6 +778,7 @@
           </w:tcPr>
           <w:p>
             <w:pPr>
+              <w:keepNext/>
               <w:rPr>
                 <w:sz w:val="8"/>
                 <w:szCs w:val="8"/>
@@ -953,7 +956,7 @@
       <w:tr>
         <w:trPr>
           <w:cantSplit/>
-          <w:trHeight w:val="420"/>
+          <w:trHeight w:val="360"/>
         </w:trPr>
         <w:tc>
           <w:tcPr>
@@ -1007,7 +1010,7 @@
       <w:tr>
         <w:trPr>
           <w:cantSplit/>
-          <w:trHeight w:val="420"/>
+          <w:trHeight w:val="360"/>
         </w:trPr>
         <w:tc>
           <w:tcPr>
@@ -1061,7 +1064,7 @@
       <w:tr>
         <w:trPr>
           <w:cantSplit/>
-          <w:trHeight w:val="420"/>
+          <w:trHeight w:val="360"/>
         </w:trPr>
         <w:tc>
           <w:tcPr>
@@ -1115,7 +1118,7 @@
       <w:tr>
         <w:trPr>
           <w:cantSplit/>
-          <w:trHeight w:val="420"/>
+          <w:trHeight w:val="360"/>
         </w:trPr>
         <w:tc>
           <w:tcPr>
@@ -1208,7 +1211,7 @@
                 <w:sz w:val="21"/>
                 <w:szCs w:val="21"/>
               </w:rPr>
-              <w:t xml:space="preserve">Course characteristics and delivery</w:t>
+              <w:t xml:space="preserve">Course characteristics</w:t>
             </w:r>
           </w:p>
         </w:tc>
@@ -1227,6 +1230,7 @@
           </w:tcPr>
           <w:p>
             <w:pPr>
+              <w:keepNext/>
               <w:rPr>
                 <w:sz w:val="8"/>
                 <w:szCs w:val="8"/>
@@ -1245,6 +1249,9 @@
             <w:gridSpan w:val="2"/>
           </w:tcPr>
           <w:p>
+            <w:pPr>
+              <w:keepNext/>
+            </w:pPr>
             <w:r>
               <w:t xml:space="preserve">Paste each course characteristic for the areas named above, taken from the current GE Framework. You may give a shortened description. Then give the assignment, or the arrangement, and where it sits on the syllabus. Where an area carries no course characteristics, write none. </w:t>
             </w:r>
@@ -1253,7 +1260,7 @@
                 <w:i/>
                 <w:iCs/>
               </w:rPr>
-              <w:t xml:space="preserve">(Add rows as needed.)</w:t>
+              <w:t xml:space="preserve">(Add rows as needed: click in the last cell of the table and press Tab.)</w:t>
             </w:r>
           </w:p>
         </w:tc>
@@ -1272,6 +1279,7 @@
           </w:tcPr>
           <w:p>
             <w:pPr>
+              <w:keepNext/>
               <w:rPr>
                 <w:sz w:val="8"/>
                 <w:szCs w:val="8"/>
@@ -1334,7 +1342,7 @@
       <w:tr>
         <w:trPr>
           <w:cantSplit/>
-          <w:trHeight w:val="380"/>
+          <w:trHeight w:val="400"/>
         </w:trPr>
         <w:tc>
           <w:tcPr>
@@ -1364,7 +1372,7 @@
       <w:tr>
         <w:trPr>
           <w:cantSplit/>
-          <w:trHeight w:val="380"/>
+          <w:trHeight w:val="400"/>
         </w:trPr>
         <w:tc>
           <w:tcPr>
@@ -1394,7 +1402,7 @@
       <w:tr>
         <w:trPr>
           <w:cantSplit/>
-          <w:trHeight w:val="380"/>
+          <w:trHeight w:val="400"/>
         </w:trPr>
         <w:tc>
           <w:tcPr>
@@ -1419,36 +1427,117 @@
             </w:tcBorders>
           </w:tcPr>
           <w:p/>
+        </w:tc>
+      </w:tr>
+    </w:tbl>
+    <w:p/>
+    <w:tbl>
+      <w:tblPr>
+        <w:tblW w:w="9450" w:type="dxa"/>
+        <w:tblLayout w:type="fixed"/>
+        <w:tblLook w:val="0600" w:firstRow="0" w:lastRow="0" w:firstColumn="0" w:lastColumn="0" w:noHBand="1" w:noVBand="1"/>
+      </w:tblPr>
+      <w:tblGrid>
+        <w:gridCol w:w="9450"/>
+      </w:tblGrid>
+      <w:tr>
+        <w:trPr>
+          <w:trHeight w:val="180"/>
+        </w:trPr>
+        <w:tc>
+          <w:tcPr>
+            <w:tcW w:w="9450" w:type="dxa"/>
+            <w:gridSpan w:val="1"/>
+            <w:tcBorders>
+              <w:bottom w:val="single" w:sz="12" w:space="0" w:color="000000"/>
+            </w:tcBorders>
+          </w:tcPr>
+          <w:p>
+            <w:pPr>
+              <w:pStyle w:val="Title"/>
+              <w:keepNext/>
+              <w:numPr>
+                <w:ilvl w:val="0"/>
+                <w:numId w:val="1"/>
+              </w:numPr>
+              <w:rPr>
+                <w:sz w:val="21"/>
+                <w:szCs w:val="21"/>
+              </w:rPr>
+            </w:pPr>
+            <w:r>
+              <w:rPr>
+                <w:sz w:val="21"/>
+                <w:szCs w:val="21"/>
+              </w:rPr>
+              <w:t xml:space="preserve">Delivery methods</w:t>
+            </w:r>
+          </w:p>
         </w:tc>
       </w:tr>
       <w:tr>
         <w:trPr>
-          <w:cantSplit/>
-          <w:trHeight w:val="380"/>
+          <w:trHeight w:val="48"/>
         </w:trPr>
         <w:tc>
           <w:tcPr>
-            <w:tcW w:w="3330" w:type="dxa"/>
-            <w:tcBorders>
-              <w:top w:val="single" w:sz="4" w:space="0" w:color="000000"/>
-              <w:left w:val="single" w:sz="4" w:space="0" w:color="000000"/>
-              <w:bottom w:val="single" w:sz="4" w:space="0" w:color="000000"/>
-              <w:right w:val="single" w:sz="4" w:space="0" w:color="000000"/>
-            </w:tcBorders>
-          </w:tcPr>
-          <w:p/>
-        </w:tc>
-        <w:tc>
-          <w:tcPr>
-            <w:tcW w:w="6120" w:type="dxa"/>
-            <w:tcBorders>
-              <w:top w:val="single" w:sz="4" w:space="0" w:color="000000"/>
-              <w:left w:val="single" w:sz="4" w:space="0" w:color="000000"/>
-              <w:bottom w:val="single" w:sz="4" w:space="0" w:color="000000"/>
-              <w:right w:val="single" w:sz="4" w:space="0" w:color="000000"/>
-            </w:tcBorders>
-          </w:tcPr>
-          <w:p/>
+            <w:tcW w:w="9450" w:type="dxa"/>
+            <w:gridSpan w:val="1"/>
+            <w:tcBorders>
+              <w:top w:val="single" w:sz="12" w:space="0" w:color="000000"/>
+            </w:tcBorders>
+          </w:tcPr>
+          <w:p>
+            <w:pPr>
+              <w:keepNext/>
+              <w:rPr>
+                <w:sz w:val="8"/>
+                <w:szCs w:val="8"/>
+              </w:rPr>
+            </w:pPr>
+          </w:p>
+        </w:tc>
+      </w:tr>
+      <w:tr>
+        <w:trPr>
+          <w:trHeight w:val="432"/>
+        </w:trPr>
+        <w:tc>
+          <w:tcPr>
+            <w:tcW w:w="9450" w:type="dxa"/>
+            <w:gridSpan w:val="1"/>
+          </w:tcPr>
+          <w:p>
+            <w:pPr>
+              <w:keepNext/>
+            </w:pPr>
+            <w:r>
+              <w:t xml:space="preserve">If one syllabus covers more than one delivery method, note what differs between them, in particular oral communication, collaboration, and the points where students receive critical feedback.</w:t>
+            </w:r>
+          </w:p>
+        </w:tc>
+      </w:tr>
+      <w:tr>
+        <w:trPr>
+          <w:trHeight w:val="80"/>
+        </w:trPr>
+        <w:tc>
+          <w:tcPr>
+            <w:tcW w:w="9450" w:type="dxa"/>
+            <w:gridSpan w:val="1"/>
+            <w:tcBorders>
+              <w:bottom w:val="single" w:sz="4" w:space="0" w:color="000000"/>
+            </w:tcBorders>
+          </w:tcPr>
+          <w:p>
+            <w:pPr>
+              <w:keepNext/>
+              <w:rPr>
+                <w:sz w:val="8"/>
+                <w:szCs w:val="8"/>
+              </w:rPr>
+            </w:pPr>
+          </w:p>
         </w:tc>
       </w:tr>
       <w:tr>
@@ -1458,23 +1547,7 @@
         </w:trPr>
         <w:tc>
           <w:tcPr>
-            <w:tcW w:w="3330" w:type="dxa"/>
-            <w:tcBorders>
-              <w:top w:val="single" w:sz="4" w:space="0" w:color="000000"/>
-              <w:left w:val="single" w:sz="4" w:space="0" w:color="000000"/>
-              <w:bottom w:val="single" w:sz="4" w:space="0" w:color="000000"/>
-              <w:right w:val="single" w:sz="4" w:space="0" w:color="000000"/>
-            </w:tcBorders>
-          </w:tcPr>
-          <w:p>
-            <w:r>
-              <w:t xml:space="preserve">Differences between delivery methods, if the syllabus covers more than one</w:t>
-            </w:r>
-          </w:p>
-        </w:tc>
-        <w:tc>
-          <w:tcPr>
-            <w:tcW w:w="6120" w:type="dxa"/>
+            <w:tcW w:w="9450" w:type="dxa"/>
             <w:tcBorders>
               <w:top w:val="single" w:sz="4" w:space="0" w:color="000000"/>
               <w:left w:val="single" w:sz="4" w:space="0" w:color="000000"/>

</xml_diff>

<commit_message>
Link the GEOC page, and point the framework links at the framework
The red block at the top now ends with a link to GEOC for Faculty
for the review process and deadlines. The instruction for pasting
course characteristics links the framework as well.

All three framework mentions now open the GE Framework starting
Fall 2027. In the original form both hyperlink relationships point
to the GEOC for Faculty page, so its GE Framework Document link
did not open the framework.
</commit_message>
<xml_diff>
--- a/committee/ccc/papers/geoc-alignment-form-proposed.docx
+++ b/committee/ccc/papers/geoc-alignment-form-proposed.docx
@@ -15,7 +15,21 @@
         <w:rPr>
           <w:color w:val="EE0000"/>
         </w:rPr>
-        <w:t xml:space="preserve">This document is required for all GEOC course recertifications/revisions/new courses.  Please attach to Curriculog. GEOC will not be able to review the course if the document is not attached.</w:t>
+        <w:t xml:space="preserve">This document is required for all GEOC course recertifications/revisions/new courses.  Please attach to Curriculog. GEOC will not be able to review the course if the document is not attached. See </w:t>
+      </w:r>
+      <w:hyperlink r:id="rId6" w:history="1">
+        <w:r>
+          <w:rPr>
+            <w:rStyle w:val="Hyperlink"/>
+          </w:rPr>
+          <w:t>GEOC for Faculty</w:t>
+        </w:r>
+      </w:hyperlink>
+      <w:r>
+        <w:rPr>
+          <w:color w:val="EE0000"/>
+        </w:rPr>
+        <w:t xml:space="preserve"> for the review process and deadlines.</w:t>
       </w:r>
     </w:p>
     <w:p/>
@@ -590,7 +604,7 @@
         </w:rPr>
         <w:t xml:space="preserve">Current list of GE areas can be found in the </w:t>
       </w:r>
-      <w:hyperlink r:id="rId5" w:history="1">
+      <w:hyperlink r:id="rId21" w:history="1">
         <w:r>
           <w:rPr>
             <w:rStyle w:val="Hyperlink"/>
@@ -641,7 +655,7 @@
       <w:r>
         <w:t xml:space="preserve">Please copy and paste the GE/Overlay/Code (if applicable) Learning Outcomes for your course into the first table, taken from the </w:t>
       </w:r>
-      <w:hyperlink r:id="rId5" w:history="1">
+      <w:hyperlink r:id="rId21" w:history="1">
         <w:r>
           <w:rPr>
             <w:rStyle w:val="Hyperlink"/>
@@ -1253,7 +1267,18 @@
               <w:keepNext/>
             </w:pPr>
             <w:r>
-              <w:t xml:space="preserve">Paste each course characteristic for the areas named above, taken from the current GE Framework. You may give a shortened description. Then give the assignment, or the arrangement, and where it sits on the syllabus. Where an area carries no course characteristics, write none. </w:t>
+              <w:t xml:space="preserve">Paste each course characteristic for the areas named above, taken from the current </w:t>
+            </w:r>
+            <w:hyperlink r:id="rId21" w:history="1">
+              <w:r>
+                <w:rPr>
+                  <w:rStyle w:val="Hyperlink"/>
+                </w:rPr>
+                <w:t>GE Framework</w:t>
+              </w:r>
+            </w:hyperlink>
+            <w:r>
+              <w:t xml:space="preserve">. You may give a shortened description. Then give the assignment, or the arrangement, and where it sits on the syllabus. Where an area carries no course characteristics, write none. </w:t>
             </w:r>
             <w:r>
               <w:rPr>

</xml_diff>

<commit_message>
Name everything the syllabus has to carry
The confirmation now covers the catalog course description, the
course learning outcomes with the GEOC outcomes for every area,
the course outline with due dates for key assignments, and the
word count for every written assignment. A small italic line links
the syllabus policy and records that the word counts are GEOC's
own requirement.

The form no longer reproduces the weekly schedule, so it states
where that schedule has to be.
</commit_message>
<xml_diff>
--- a/committee/ccc/papers/geoc-alignment-form-proposed.docx
+++ b/committee/ccc/papers/geoc-alignment-form-proposed.docx
@@ -647,7 +647,39 @@
         </w:sdtContent>
       </w:sdt>
       <w:r>
-        <w:t xml:space="preserve">  The attached syllabus carries the catalog course description, and the GEOC learning outcomes for every area named above</w:t>
+        <w:t xml:space="preserve">  The attached syllabus carries the catalog course description, the course learning outcomes together with the GEOC learning outcomes for every area named above, a course outline with due dates for key assignments, and the word count for every written assignment.</w:t>
+      </w:r>
+    </w:p>
+    <w:p>
+      <w:r>
+        <w:rPr>
+          <w:i/>
+          <w:iCs/>
+          <w:sz w:val="14"/>
+          <w:szCs w:val="14"/>
+        </w:rPr>
+        <w:t xml:space="preserve">Required by the </w:t>
+      </w:r>
+      <w:hyperlink r:id="rId22" w:history="1">
+        <w:r>
+          <w:rPr>
+            <w:rStyle w:val="Hyperlink"/>
+            <w:i/>
+            <w:iCs/>
+            <w:sz w:val="14"/>
+            <w:szCs w:val="14"/>
+          </w:rPr>
+          <w:t>syllabus policy, 25-26 CIC 1</w:t>
+        </w:r>
+      </w:hyperlink>
+      <w:r>
+        <w:rPr>
+          <w:i/>
+          <w:iCs/>
+          <w:sz w:val="14"/>
+          <w:szCs w:val="14"/>
+        </w:rPr>
+        <w:t xml:space="preserve">. Word counts are a GEOC requirement.</w:t>
       </w:r>
     </w:p>
     <w:p/>
@@ -970,7 +1002,7 @@
       <w:tr>
         <w:trPr>
           <w:cantSplit/>
-          <w:trHeight w:val="360"/>
+          <w:trHeight w:val="380"/>
         </w:trPr>
         <w:tc>
           <w:tcPr>
@@ -1024,7 +1056,7 @@
       <w:tr>
         <w:trPr>
           <w:cantSplit/>
-          <w:trHeight w:val="360"/>
+          <w:trHeight w:val="380"/>
         </w:trPr>
         <w:tc>
           <w:tcPr>
@@ -1078,61 +1110,7 @@
       <w:tr>
         <w:trPr>
           <w:cantSplit/>
-          <w:trHeight w:val="360"/>
-        </w:trPr>
-        <w:tc>
-          <w:tcPr>
-            <w:tcW w:w="2340" w:type="dxa"/>
-            <w:tcBorders>
-              <w:top w:val="single" w:sz="4" w:space="0" w:color="000000"/>
-              <w:left w:val="single" w:sz="4" w:space="0" w:color="000000"/>
-              <w:bottom w:val="single" w:sz="4" w:space="0" w:color="000000"/>
-              <w:right w:val="single" w:sz="4" w:space="0" w:color="000000"/>
-            </w:tcBorders>
-          </w:tcPr>
-          <w:p/>
-        </w:tc>
-        <w:tc>
-          <w:tcPr>
-            <w:tcW w:w="990" w:type="dxa"/>
-            <w:tcBorders>
-              <w:top w:val="single" w:sz="4" w:space="0" w:color="000000"/>
-              <w:left w:val="single" w:sz="4" w:space="0" w:color="000000"/>
-              <w:bottom w:val="single" w:sz="4" w:space="0" w:color="000000"/>
-              <w:right w:val="single" w:sz="4" w:space="0" w:color="000000"/>
-            </w:tcBorders>
-          </w:tcPr>
-          <w:p/>
-        </w:tc>
-        <w:tc>
-          <w:tcPr>
-            <w:tcW w:w="2790" w:type="dxa"/>
-            <w:tcBorders>
-              <w:top w:val="single" w:sz="4" w:space="0" w:color="000000"/>
-              <w:left w:val="single" w:sz="4" w:space="0" w:color="000000"/>
-              <w:bottom w:val="single" w:sz="4" w:space="0" w:color="000000"/>
-              <w:right w:val="single" w:sz="4" w:space="0" w:color="000000"/>
-            </w:tcBorders>
-          </w:tcPr>
-          <w:p/>
-        </w:tc>
-        <w:tc>
-          <w:tcPr>
-            <w:tcW w:w="3330" w:type="dxa"/>
-            <w:tcBorders>
-              <w:top w:val="single" w:sz="4" w:space="0" w:color="000000"/>
-              <w:left w:val="single" w:sz="4" w:space="0" w:color="000000"/>
-              <w:bottom w:val="single" w:sz="4" w:space="0" w:color="000000"/>
-              <w:right w:val="single" w:sz="4" w:space="0" w:color="000000"/>
-            </w:tcBorders>
-          </w:tcPr>
-          <w:p/>
-        </w:tc>
-      </w:tr>
-      <w:tr>
-        <w:trPr>
-          <w:cantSplit/>
-          <w:trHeight w:val="360"/>
+          <w:trHeight w:val="380"/>
         </w:trPr>
         <w:tc>
           <w:tcPr>
@@ -1367,7 +1345,7 @@
       <w:tr>
         <w:trPr>
           <w:cantSplit/>
-          <w:trHeight w:val="400"/>
+          <w:trHeight w:val="350"/>
         </w:trPr>
         <w:tc>
           <w:tcPr>
@@ -1397,7 +1375,7 @@
       <w:tr>
         <w:trPr>
           <w:cantSplit/>
-          <w:trHeight w:val="400"/>
+          <w:trHeight w:val="350"/>
         </w:trPr>
         <w:tc>
           <w:tcPr>
@@ -1427,7 +1405,7 @@
       <w:tr>
         <w:trPr>
           <w:cantSplit/>
-          <w:trHeight w:val="400"/>
+          <w:trHeight w:val="350"/>
         </w:trPr>
         <w:tc>
           <w:tcPr>
@@ -1568,7 +1546,7 @@
       <w:tr>
         <w:trPr>
           <w:cantSplit/>
-          <w:trHeight w:val="420"/>
+          <w:trHeight w:val="380"/>
         </w:trPr>
         <w:tc>
           <w:tcPr>

</xml_diff>

<commit_message>
Qualify the word count requirement
Word counts now read as required where an area sets a writing
requirement, which is 1B, UD-3, UD-4, and Second Composition. Most
areas set none.
</commit_message>
<xml_diff>
--- a/committee/ccc/papers/geoc-alignment-form-proposed.docx
+++ b/committee/ccc/papers/geoc-alignment-form-proposed.docx
@@ -647,7 +647,7 @@
         </w:sdtContent>
       </w:sdt>
       <w:r>
-        <w:t xml:space="preserve">  The attached syllabus carries the catalog course description, the course learning outcomes together with the GEOC learning outcomes for every area named above, a course outline with due dates for key assignments, and the word count for every written assignment.</w:t>
+        <w:t xml:space="preserve">  The attached syllabus carries the catalog course description, the course learning outcomes together with the GEOC learning outcomes for every area named above, a course outline with due dates for key assignments, and, where an area sets a writing requirement, the word count for the assignments that meet it.</w:t>
       </w:r>
     </w:p>
     <w:p>
@@ -679,7 +679,7 @@
           <w:sz w:val="14"/>
           <w:szCs w:val="14"/>
         </w:rPr>
-        <w:t xml:space="preserve">. Word counts are a GEOC requirement.</w:t>
+        <w:t xml:space="preserve">. GEOC requires the word counts.</w:t>
       </w:r>
     </w:p>
     <w:p/>

</xml_diff>

<commit_message>
Space the header block, and drop the Area 6 note
Blank lines now separate proposal type, course number, the area
block, and the originator and syllabus confirmation. The note
pointing to the framework for the list of areas sits directly
under the area prompt, above the check boxes.

Area 6 note removed.

The form runs to two pages: sections 1 and 2 on the first,
delivery methods on the second with a full box to write in. Four
blank rows in the outcome table, three in the characteristics
table.
</commit_message>
<xml_diff>
--- a/committee/ccc/papers/geoc-alignment-form-proposed.docx
+++ b/committee/ccc/papers/geoc-alignment-form-proposed.docx
@@ -101,16 +101,45 @@
         <w:t xml:space="preserve">  New course</w:t>
       </w:r>
     </w:p>
+    <w:p/>
     <w:p>
       <w:r>
         <w:t xml:space="preserve">Course Name and Number ____________________________________</w:t>
+      </w:r>
+    </w:p>
+    <w:p/>
+    <w:p>
+      <w:r>
+        <w:t xml:space="preserve">GE/Overlay/Code area or areas this proposal is for:</w:t>
       </w:r>
     </w:p>
     <w:p>
       <w:r>
-        <w:t xml:space="preserve">GE/Overlay/Code area or areas this proposal is for:</w:t>
+        <w:rPr>
+          <w:i/>
+          <w:iCs/>
+        </w:rPr>
+        <w:t xml:space="preserve">Current list of GE areas can be found in the </w:t>
+      </w:r>
+      <w:hyperlink r:id="rId21" w:history="1">
+        <w:r>
+          <w:rPr>
+            <w:rStyle w:val="Hyperlink"/>
+            <w:i/>
+            <w:iCs/>
+          </w:rPr>
+          <w:t>GE Framework document</w:t>
+        </w:r>
+      </w:hyperlink>
+      <w:r>
+        <w:rPr>
+          <w:i/>
+          <w:iCs/>
+        </w:rPr>
+        <w:t xml:space="preserve">.</w:t>
       </w:r>
     </w:p>
+    <w:p/>
     <w:p>
       <w:r>
         <w:t xml:space="preserve">Lower division   </w:t>
@@ -596,32 +625,7 @@
         <w:t xml:space="preserve">  W (University Writing Requirement)   </w:t>
       </w:r>
     </w:p>
-    <w:p>
-      <w:r>
-        <w:rPr>
-          <w:i/>
-          <w:iCs/>
-        </w:rPr>
-        <w:t xml:space="preserve">Current list of GE areas can be found in the </w:t>
-      </w:r>
-      <w:hyperlink r:id="rId21" w:history="1">
-        <w:r>
-          <w:rPr>
-            <w:rStyle w:val="Hyperlink"/>
-            <w:i/>
-            <w:iCs/>
-          </w:rPr>
-          <w:t>GE Framework document</w:t>
-        </w:r>
-      </w:hyperlink>
-      <w:r>
-        <w:rPr>
-          <w:i/>
-          <w:iCs/>
-        </w:rPr>
-        <w:t xml:space="preserve">.</w:t>
-      </w:r>
-    </w:p>
+    <w:p/>
     <w:p>
       <w:r>
         <w:t xml:space="preserve">Originator ____________________________________________</w:t>
@@ -794,20 +798,6 @@
               <w:t xml:space="preserve">(Add rows as needed: click in the last cell of the table and press Tab.)</w:t>
             </w:r>
           </w:p>
-          <w:p>
-            <w:pPr>
-              <w:keepNext/>
-            </w:pPr>
-            <w:r>
-              <w:rPr>
-                <w:i/>
-                <w:iCs/>
-                <w:sz w:val="14"/>
-                <w:szCs w:val="14"/>
-              </w:rPr>
-              <w:t xml:space="preserve">An Area 6 course meets three of the five Area 6 learning outcomes, and the three it meets are published on the course syllabus.</w:t>
-            </w:r>
-          </w:p>
         </w:tc>
       </w:tr>
       <w:tr>
@@ -1002,7 +992,7 @@
       <w:tr>
         <w:trPr>
           <w:cantSplit/>
-          <w:trHeight w:val="380"/>
+          <w:trHeight w:val="460"/>
         </w:trPr>
         <w:tc>
           <w:tcPr>
@@ -1056,7 +1046,7 @@
       <w:tr>
         <w:trPr>
           <w:cantSplit/>
-          <w:trHeight w:val="380"/>
+          <w:trHeight w:val="460"/>
         </w:trPr>
         <w:tc>
           <w:tcPr>
@@ -1110,7 +1100,61 @@
       <w:tr>
         <w:trPr>
           <w:cantSplit/>
-          <w:trHeight w:val="380"/>
+          <w:trHeight w:val="460"/>
+        </w:trPr>
+        <w:tc>
+          <w:tcPr>
+            <w:tcW w:w="2340" w:type="dxa"/>
+            <w:tcBorders>
+              <w:top w:val="single" w:sz="4" w:space="0" w:color="000000"/>
+              <w:left w:val="single" w:sz="4" w:space="0" w:color="000000"/>
+              <w:bottom w:val="single" w:sz="4" w:space="0" w:color="000000"/>
+              <w:right w:val="single" w:sz="4" w:space="0" w:color="000000"/>
+            </w:tcBorders>
+          </w:tcPr>
+          <w:p/>
+        </w:tc>
+        <w:tc>
+          <w:tcPr>
+            <w:tcW w:w="990" w:type="dxa"/>
+            <w:tcBorders>
+              <w:top w:val="single" w:sz="4" w:space="0" w:color="000000"/>
+              <w:left w:val="single" w:sz="4" w:space="0" w:color="000000"/>
+              <w:bottom w:val="single" w:sz="4" w:space="0" w:color="000000"/>
+              <w:right w:val="single" w:sz="4" w:space="0" w:color="000000"/>
+            </w:tcBorders>
+          </w:tcPr>
+          <w:p/>
+        </w:tc>
+        <w:tc>
+          <w:tcPr>
+            <w:tcW w:w="2790" w:type="dxa"/>
+            <w:tcBorders>
+              <w:top w:val="single" w:sz="4" w:space="0" w:color="000000"/>
+              <w:left w:val="single" w:sz="4" w:space="0" w:color="000000"/>
+              <w:bottom w:val="single" w:sz="4" w:space="0" w:color="000000"/>
+              <w:right w:val="single" w:sz="4" w:space="0" w:color="000000"/>
+            </w:tcBorders>
+          </w:tcPr>
+          <w:p/>
+        </w:tc>
+        <w:tc>
+          <w:tcPr>
+            <w:tcW w:w="3330" w:type="dxa"/>
+            <w:tcBorders>
+              <w:top w:val="single" w:sz="4" w:space="0" w:color="000000"/>
+              <w:left w:val="single" w:sz="4" w:space="0" w:color="000000"/>
+              <w:bottom w:val="single" w:sz="4" w:space="0" w:color="000000"/>
+              <w:right w:val="single" w:sz="4" w:space="0" w:color="000000"/>
+            </w:tcBorders>
+          </w:tcPr>
+          <w:p/>
+        </w:tc>
+      </w:tr>
+      <w:tr>
+        <w:trPr>
+          <w:cantSplit/>
+          <w:trHeight w:val="460"/>
         </w:trPr>
         <w:tc>
           <w:tcPr>
@@ -1345,7 +1389,7 @@
       <w:tr>
         <w:trPr>
           <w:cantSplit/>
-          <w:trHeight w:val="350"/>
+          <w:trHeight w:val="440"/>
         </w:trPr>
         <w:tc>
           <w:tcPr>
@@ -1375,7 +1419,7 @@
       <w:tr>
         <w:trPr>
           <w:cantSplit/>
-          <w:trHeight w:val="350"/>
+          <w:trHeight w:val="440"/>
         </w:trPr>
         <w:tc>
           <w:tcPr>
@@ -1405,7 +1449,7 @@
       <w:tr>
         <w:trPr>
           <w:cantSplit/>
-          <w:trHeight w:val="350"/>
+          <w:trHeight w:val="440"/>
         </w:trPr>
         <w:tc>
           <w:tcPr>
@@ -1546,7 +1590,7 @@
       <w:tr>
         <w:trPr>
           <w:cantSplit/>
-          <w:trHeight w:val="380"/>
+          <w:trHeight w:val="1100"/>
         </w:trPr>
         <w:tc>
           <w:tcPr>

</xml_diff>

<commit_message>
Merge the source note into the syllabus confirmation
The syllabus policy sentence now runs on inside the check box
paragraph rather than sitting beneath it as small italic, and a
blank line separates the confirmation from the originator line.
</commit_message>
<xml_diff>
--- a/committee/ccc/papers/geoc-alignment-form-proposed.docx
+++ b/committee/ccc/papers/geoc-alignment-form-proposed.docx
@@ -631,6 +631,7 @@
         <w:t xml:space="preserve">Originator ____________________________________________</w:t>
       </w:r>
     </w:p>
+    <w:p/>
     <w:p>
       <w:sdt>
         <w:sdtPr>
@@ -651,38 +652,17 @@
         </w:sdtContent>
       </w:sdt>
       <w:r>
-        <w:t xml:space="preserve">  The attached syllabus carries the catalog course description, the course learning outcomes together with the GEOC learning outcomes for every area named above, a course outline with due dates for key assignments, and, where an area sets a writing requirement, the word count for the assignments that meet it.</w:t>
-      </w:r>
-    </w:p>
-    <w:p>
-      <w:r>
-        <w:rPr>
-          <w:i/>
-          <w:iCs/>
-          <w:sz w:val="14"/>
-          <w:szCs w:val="14"/>
-        </w:rPr>
-        <w:t xml:space="preserve">Required by the </w:t>
+        <w:t xml:space="preserve">  The attached syllabus carries the catalog course description, the course learning outcomes together with the GEOC learning outcomes for every area named above, a course outline with due dates for key assignments, and, where an area sets a writing requirement, the word count for the assignments that meet it. Required by the </w:t>
       </w:r>
       <w:hyperlink r:id="rId22" w:history="1">
         <w:r>
           <w:rPr>
             <w:rStyle w:val="Hyperlink"/>
-            <w:i/>
-            <w:iCs/>
-            <w:sz w:val="14"/>
-            <w:szCs w:val="14"/>
           </w:rPr>
           <w:t>syllabus policy, 25-26 CIC 1</w:t>
         </w:r>
       </w:hyperlink>
       <w:r>
-        <w:rPr>
-          <w:i/>
-          <w:iCs/>
-          <w:sz w:val="14"/>
-          <w:szCs w:val="14"/>
-        </w:rPr>
         <w:t xml:space="preserve">. GEOC requires the word counts.</w:t>
       </w:r>
     </w:p>

</xml_diff>

<commit_message>
Italicize the policy sentence in the syllabus confirmation
Required by the syllabus policy, 25-26 CIC 1, and the note on word
counts, are italic, including the link, and stay inline in the
check box paragraph.
</commit_message>
<xml_diff>
--- a/committee/ccc/papers/geoc-alignment-form-proposed.docx
+++ b/committee/ccc/papers/geoc-alignment-form-proposed.docx
@@ -652,17 +652,30 @@
         </w:sdtContent>
       </w:sdt>
       <w:r>
-        <w:t xml:space="preserve">  The attached syllabus carries the catalog course description, the course learning outcomes together with the GEOC learning outcomes for every area named above, a course outline with due dates for key assignments, and, where an area sets a writing requirement, the word count for the assignments that meet it. Required by the </w:t>
+        <w:t xml:space="preserve">  The attached syllabus carries the catalog course description, the course learning outcomes together with the GEOC learning outcomes for every area named above, a course outline with due dates for key assignments, and, where an area sets a writing requirement, the word count for the assignments that meet it. </w:t>
+      </w:r>
+      <w:r>
+        <w:rPr>
+          <w:i/>
+          <w:iCs/>
+        </w:rPr>
+        <w:t xml:space="preserve">Required by the </w:t>
       </w:r>
       <w:hyperlink r:id="rId22" w:history="1">
         <w:r>
           <w:rPr>
             <w:rStyle w:val="Hyperlink"/>
+            <w:i/>
+            <w:iCs/>
           </w:rPr>
           <w:t>syllabus policy, 25-26 CIC 1</w:t>
         </w:r>
       </w:hyperlink>
       <w:r>
+        <w:rPr>
+          <w:i/>
+          <w:iCs/>
+        </w:rPr>
         <w:t xml:space="preserve">. GEOC requires the word counts.</w:t>
       </w:r>
     </w:p>

</xml_diff>

<commit_message>
Move the paste instruction into section 1
The paragraph telling the filer to copy the learning outcomes from
the GE Framework now opens the section 1 instruction, where the
table it refers to is, and carries the naming of weeks and
assignments with it. Section 2 opens with Please, matching it.
</commit_message>
<xml_diff>
--- a/committee/ccc/papers/geoc-alignment-form-proposed.docx
+++ b/committee/ccc/papers/geoc-alignment-form-proposed.docx
@@ -680,23 +680,6 @@
       </w:r>
     </w:p>
     <w:p/>
-    <w:p>
-      <w:r>
-        <w:t xml:space="preserve">Please copy and paste the GE/Overlay/Code (if applicable) Learning Outcomes for your course into the first table, taken from the </w:t>
-      </w:r>
-      <w:hyperlink r:id="rId21" w:history="1">
-        <w:r>
-          <w:rPr>
-            <w:rStyle w:val="Hyperlink"/>
-          </w:rPr>
-          <w:t>GE Framework Document</w:t>
-        </w:r>
-      </w:hyperlink>
-      <w:r>
-        <w:t xml:space="preserve">. Name weeks and assignments as they appear on the attached syllabus.</w:t>
-      </w:r>
-    </w:p>
-    <w:p/>
     <w:tbl>
       <w:tblPr>
         <w:tblW w:w="9450" w:type="dxa"/>
@@ -781,7 +764,18 @@
               <w:keepNext/>
             </w:pPr>
             <w:r>
-              <w:t xml:space="preserve">One row for each GEOC learning outcome in the areas named above, overlays included, copied in full from the current GE Framework. For Area 6, give the three outcomes the course meets. Then give the weeks in which the outcome is taught, what students do in those weeks, and the assignment in which they demonstrate it. One or two sentences to a cell. </w:t>
+              <w:t xml:space="preserve">Please copy and paste the GE/Overlay/Code (if applicable) Learning Outcomes for your course into the table below, taken from the </w:t>
+            </w:r>
+            <w:hyperlink r:id="rId21" w:history="1">
+              <w:r>
+                <w:rPr>
+                  <w:rStyle w:val="Hyperlink"/>
+                </w:rPr>
+                <w:t>GE Framework Document</w:t>
+              </w:r>
+            </w:hyperlink>
+            <w:r>
+              <w:t xml:space="preserve">, one row for each outcome in the areas named above, overlays included. For Area 6, give the three outcomes the course meets. Then give the weeks in which the outcome is taught, what students do in those weeks, and the assignment in which they demonstrate it, naming weeks and assignments as they appear on the attached syllabus. One or two sentences to a cell. </w:t>
             </w:r>
             <w:r>
               <w:rPr>
@@ -1282,7 +1276,7 @@
               <w:keepNext/>
             </w:pPr>
             <w:r>
-              <w:t xml:space="preserve">Paste each course characteristic for the areas named above, taken from the current </w:t>
+              <w:t xml:space="preserve">Please paste each course characteristic for the areas named above, taken from the current </w:t>
             </w:r>
             <w:hyperlink r:id="rId21" w:history="1">
               <w:r>

</xml_diff>

<commit_message>
Add a course characteristic example, and italicize both
Section 2 gets a worked row: the UD-3 advanced writing
characteristic against three assignments whose word counts reach
the 4,000 minimum. Both example rows are italic so a filer can see
at a glance what to replace.
</commit_message>
<xml_diff>
--- a/committee/ccc/papers/geoc-alignment-form-proposed.docx
+++ b/committee/ccc/papers/geoc-alignment-form-proposed.docx
@@ -923,6 +923,10 @@
           </w:tcPr>
           <w:p>
             <w:r>
+              <w:rPr>
+                <w:i/>
+                <w:iCs/>
+              </w:rPr>
               <w:t xml:space="preserve">Example:  UD-3 LO1: Apply disciplinary methodologies from the arts and/or humanities to analyze aspects of human culture.</w:t>
             </w:r>
           </w:p>
@@ -939,6 +943,10 @@
           </w:tcPr>
           <w:p>
             <w:r>
+              <w:rPr>
+                <w:i/>
+                <w:iCs/>
+              </w:rPr>
               <w:t xml:space="preserve">2, 5-7, 11</w:t>
             </w:r>
           </w:p>
@@ -955,6 +963,10 @@
           </w:tcPr>
           <w:p>
             <w:r>
+              <w:rPr>
+                <w:i/>
+                <w:iCs/>
+              </w:rPr>
               <w:t xml:space="preserve">Students apply close reading and contextual analysis to assigned works, and rehearse the method in weekly discussion.</w:t>
             </w:r>
           </w:p>
@@ -971,6 +983,10 @@
           </w:tcPr>
           <w:p>
             <w:r>
+              <w:rPr>
+                <w:i/>
+                <w:iCs/>
+              </w:rPr>
               <w:t xml:space="preserve">Final research presentation, evaluated with the posted rubric for method and use of sources.</w:t>
             </w:r>
           </w:p>
@@ -1388,7 +1404,15 @@
               <w:right w:val="single" w:sz="4" w:space="0" w:color="000000"/>
             </w:tcBorders>
           </w:tcPr>
-          <w:p/>
+          <w:p>
+            <w:r>
+              <w:rPr>
+                <w:i/>
+                <w:iCs/>
+              </w:rPr>
+              <w:t xml:space="preserve">Example:  UD-3 (a) Advanced writing, a minimum of 4,000 assigned words, with critical feedback from the instructor.</w:t>
+            </w:r>
+          </w:p>
         </w:tc>
         <w:tc>
           <w:tcPr>
@@ -1400,7 +1424,15 @@
               <w:right w:val="single" w:sz="4" w:space="0" w:color="000000"/>
             </w:tcBorders>
           </w:tcPr>
-          <w:p/>
+          <w:p>
+            <w:r>
+              <w:rPr>
+                <w:i/>
+                <w:iCs/>
+              </w:rPr>
+              <w:t xml:space="preserve">Two 1,200-word analyses, due in weeks 6 and 10, and a 1,600-word final paper drafted in week 12, with comments returned before revision.</w:t>
+            </w:r>
+          </w:p>
         </w:tc>
       </w:tr>
       <w:tr>

</xml_diff>

<commit_message>
Three blank rows under each example, and a reading pass
Both tables now carry the worked example followed by three blank
rows.

The framework is called the GE Framework document in all three
places it appears, and section 2 now reads give the assignment or
arrangement that meets it.
</commit_message>
<xml_diff>
--- a/committee/ccc/papers/geoc-alignment-form-proposed.docx
+++ b/committee/ccc/papers/geoc-alignment-form-proposed.docx
@@ -771,7 +771,7 @@
                 <w:rPr>
                   <w:rStyle w:val="Hyperlink"/>
                 </w:rPr>
-                <w:t>GE Framework Document</w:t>
+                <w:t>GE Framework document</w:t>
               </w:r>
             </w:hyperlink>
             <w:r>
@@ -990,60 +990,6 @@
               <w:t xml:space="preserve">Final research presentation, evaluated with the posted rubric for method and use of sources.</w:t>
             </w:r>
           </w:p>
-        </w:tc>
-      </w:tr>
-      <w:tr>
-        <w:trPr>
-          <w:cantSplit/>
-          <w:trHeight w:val="460"/>
-        </w:trPr>
-        <w:tc>
-          <w:tcPr>
-            <w:tcW w:w="2340" w:type="dxa"/>
-            <w:tcBorders>
-              <w:top w:val="single" w:sz="4" w:space="0" w:color="000000"/>
-              <w:left w:val="single" w:sz="4" w:space="0" w:color="000000"/>
-              <w:bottom w:val="single" w:sz="4" w:space="0" w:color="000000"/>
-              <w:right w:val="single" w:sz="4" w:space="0" w:color="000000"/>
-            </w:tcBorders>
-          </w:tcPr>
-          <w:p/>
-        </w:tc>
-        <w:tc>
-          <w:tcPr>
-            <w:tcW w:w="990" w:type="dxa"/>
-            <w:tcBorders>
-              <w:top w:val="single" w:sz="4" w:space="0" w:color="000000"/>
-              <w:left w:val="single" w:sz="4" w:space="0" w:color="000000"/>
-              <w:bottom w:val="single" w:sz="4" w:space="0" w:color="000000"/>
-              <w:right w:val="single" w:sz="4" w:space="0" w:color="000000"/>
-            </w:tcBorders>
-          </w:tcPr>
-          <w:p/>
-        </w:tc>
-        <w:tc>
-          <w:tcPr>
-            <w:tcW w:w="2790" w:type="dxa"/>
-            <w:tcBorders>
-              <w:top w:val="single" w:sz="4" w:space="0" w:color="000000"/>
-              <w:left w:val="single" w:sz="4" w:space="0" w:color="000000"/>
-              <w:bottom w:val="single" w:sz="4" w:space="0" w:color="000000"/>
-              <w:right w:val="single" w:sz="4" w:space="0" w:color="000000"/>
-            </w:tcBorders>
-          </w:tcPr>
-          <w:p/>
-        </w:tc>
-        <w:tc>
-          <w:tcPr>
-            <w:tcW w:w="3330" w:type="dxa"/>
-            <w:tcBorders>
-              <w:top w:val="single" w:sz="4" w:space="0" w:color="000000"/>
-              <w:left w:val="single" w:sz="4" w:space="0" w:color="000000"/>
-              <w:bottom w:val="single" w:sz="4" w:space="0" w:color="000000"/>
-              <w:right w:val="single" w:sz="4" w:space="0" w:color="000000"/>
-            </w:tcBorders>
-          </w:tcPr>
-          <w:p/>
         </w:tc>
       </w:tr>
       <w:tr>
@@ -1299,11 +1245,11 @@
                 <w:rPr>
                   <w:rStyle w:val="Hyperlink"/>
                 </w:rPr>
-                <w:t>GE Framework</w:t>
+                <w:t>GE Framework document</w:t>
               </w:r>
             </w:hyperlink>
             <w:r>
-              <w:t xml:space="preserve">. You may give a shortened description. Then give the assignment, or the arrangement, and where it sits on the syllabus. Where an area carries no course characteristics, write none. </w:t>
+              <w:t xml:space="preserve">. You may give a shortened description. Then give the assignment or arrangement that meets it, and where it sits on the syllabus. Where an area carries no course characteristics, write none. </w:t>
             </w:r>
             <w:r>
               <w:rPr>
@@ -1433,6 +1379,36 @@
               <w:t xml:space="preserve">Two 1,200-word analyses, due in weeks 6 and 10, and a 1,600-word final paper drafted in week 12, with comments returned before revision.</w:t>
             </w:r>
           </w:p>
+        </w:tc>
+      </w:tr>
+      <w:tr>
+        <w:trPr>
+          <w:cantSplit/>
+          <w:trHeight w:val="440"/>
+        </w:trPr>
+        <w:tc>
+          <w:tcPr>
+            <w:tcW w:w="3330" w:type="dxa"/>
+            <w:tcBorders>
+              <w:top w:val="single" w:sz="4" w:space="0" w:color="000000"/>
+              <w:left w:val="single" w:sz="4" w:space="0" w:color="000000"/>
+              <w:bottom w:val="single" w:sz="4" w:space="0" w:color="000000"/>
+              <w:right w:val="single" w:sz="4" w:space="0" w:color="000000"/>
+            </w:tcBorders>
+          </w:tcPr>
+          <w:p/>
+        </w:tc>
+        <w:tc>
+          <w:tcPr>
+            <w:tcW w:w="6120" w:type="dxa"/>
+            <w:tcBorders>
+              <w:top w:val="single" w:sz="4" w:space="0" w:color="000000"/>
+              <w:left w:val="single" w:sz="4" w:space="0" w:color="000000"/>
+              <w:bottom w:val="single" w:sz="4" w:space="0" w:color="000000"/>
+              <w:right w:val="single" w:sz="4" w:space="0" w:color="000000"/>
+            </w:tcBorders>
+          </w:tcPr>
+          <w:p/>
         </w:tc>
       </w:tr>
       <w:tr>

</xml_diff>